<commit_message>
REPARG-001: contraoferta v2 con condiciones pactadas y fecha de emisión 23-10-2026
- Forma de pago pactada: reserva USD 82.000 + seña de trato USD 168.000
  (contrato privado en escribanía, <=30 días corridos) + saldo USD 570.000
  (escritura, 180 días hábiles), todo por transferencia bancaria.
- Vigencia 30 días hábiles desde la emisión; comisión 5,5 % 100 % a cargo de
  la vendedora; gastos de transferencia 50/50; IVA de venta e impuestos
  inmobiliarios a cargo de la vendedora; sujeción a aprobación bancaria.
- Referencia a la carta de presentación de cliente e intermediación de ambos
  asesores; toda mención de Meridiano en la intermediación va 'a través de su
  broker inmobiliario Juan José Castillo'.
- Documentos fuente versionados (solo nombre + C.I., PII_POLICY) y hoja de
  control actualizada con alerta sobre la base del IVA (D-082: 1,5 % efectivo).

Co-Authored-By: Claude Opus 5.5 <noreply@anthropic.com>
Claude-Session: https://claude.ai/code/session_013JkVV9TZYdzYDskFW6suGV
</commit_message>
<xml_diff>
--- a/contracts/cases/REPARG-001/client-response/Respuesta_Contraoferta_Republica_Argentina_Meridiano.docx
+++ b/contracts/cases/REPARG-001/client-response/Respuesta_Contraoferta_Republica_Argentina_Meridiano.docx
@@ -5,7 +5,7 @@
     <w:p>
       <w:pPr>
         <w:keepNext w:val="0"/>
-        <w:spacing w:before="0" w:after="20" w:line="264" w:lineRule="auto"/>
+        <w:spacing w:before="0" w:after="20" w:line="254" w:lineRule="auto"/>
         <w:jc w:val="right"/>
       </w:pPr>
       <w:r>
@@ -16,23 +16,13 @@
           <w:color w:val="6B6154"/>
           <w:sz w:val="19"/>
         </w:rPr>
-        <w:t xml:space="preserve">Asunción, </w:t>
-      </w:r>
-      <w:r>
-        <w:rPr>
-          <w:rFonts w:ascii="Poppins" w:hAnsi="Poppins" w:eastAsia="Poppins"/>
-          <w:b/>
-          <w:i w:val="0"/>
-          <w:color w:val="A87D22"/>
-          <w:sz w:val="19"/>
-        </w:rPr>
-        <w:t>[fecha de emisión — completar]</w:t>
+        <w:t>Asunción, 23 de octubre de 2026</w:t>
       </w:r>
     </w:p>
     <w:p>
       <w:pPr>
         <w:keepNext w:val="0"/>
-        <w:spacing w:before="0" w:after="160" w:line="264" w:lineRule="auto"/>
+        <w:spacing w:before="0" w:after="120" w:line="254" w:lineRule="auto"/>
         <w:jc w:val="right"/>
       </w:pPr>
       <w:r>
@@ -49,7 +39,7 @@
     <w:p>
       <w:pPr>
         <w:keepNext w:val="0"/>
-        <w:spacing w:before="0" w:after="20" w:line="264" w:lineRule="auto"/>
+        <w:spacing w:before="0" w:after="20" w:line="254" w:lineRule="auto"/>
         <w:jc w:val="left"/>
       </w:pPr>
       <w:r>
@@ -66,7 +56,7 @@
     <w:p>
       <w:pPr>
         <w:keepNext w:val="0"/>
-        <w:spacing w:before="0" w:after="0" w:line="264" w:lineRule="auto"/>
+        <w:spacing w:before="0" w:after="0" w:line="254" w:lineRule="auto"/>
         <w:jc w:val="left"/>
       </w:pPr>
       <w:r>
@@ -77,13 +67,13 @@
           <w:color w:val="A87D22"/>
           <w:sz w:val="23"/>
         </w:rPr>
-        <w:t>Edificio República Argentina esquina Tobatí — Asunción</w:t>
+        <w:t>Edificio Inox — República Argentina esquina Tobatí, Asunción</w:t>
       </w:r>
     </w:p>
     <w:p>
       <w:pPr>
         <w:keepNext w:val="0"/>
-        <w:spacing w:before="40" w:after="120" w:line="264" w:lineRule="auto"/>
+        <w:spacing w:before="40" w:after="100" w:line="254" w:lineRule="auto"/>
         <w:jc w:val="both"/>
         <w:pBdr>
           <w:bottom w:val="single" w:sz="6" w:color="C9982E"/>
@@ -105,8 +95,8 @@
         </w:tblBorders>
         <w:tblLayout w:type="fixed"/>
         <w:tblCellMar>
-          <w:top w:w="30" w:type="dxa"/>
-          <w:bottom w:w="30" w:type="dxa"/>
+          <w:top w:w="28" w:type="dxa"/>
+          <w:bottom w:w="28" w:type="dxa"/>
           <w:left w:w="110" w:type="dxa"/>
           <w:right w:w="110" w:type="dxa"/>
         </w:tblCellMar>
@@ -211,57 +201,7 @@
                 <w:color w:val="2A2620"/>
                 <w:sz w:val="17"/>
               </w:rPr>
-              <w:t>M.T. BAT Sociedad Anónima</w:t>
-            </w:r>
-          </w:p>
-        </w:tc>
-      </w:tr>
-      <w:tr>
-        <w:trPr>
-          <w:cantSplit/>
-        </w:trPr>
-        <w:tc>
-          <w:tcPr>
-            <w:tcW w:type="dxa" w:w="2381"/>
-            <w:shd w:val="clear" w:color="auto" w:fill="F3EDE3"/>
-            <w:vAlign w:val="center"/>
-          </w:tcPr>
-          <w:p>
-            <w:pPr>
-              <w:spacing w:after="0"/>
-              <w:jc w:val="left"/>
-            </w:pPr>
-            <w:r>
-              <w:rPr>
-                <w:rFonts w:ascii="Poppins" w:hAnsi="Poppins" w:eastAsia="Poppins"/>
-                <w:b/>
-                <w:i w:val="0"/>
-                <w:color w:val="14313A"/>
-                <w:sz w:val="15"/>
-              </w:rPr>
-              <w:t>REPRESENTANTE IDENTIFICADA</w:t>
-            </w:r>
-          </w:p>
-        </w:tc>
-        <w:tc>
-          <w:tcPr>
-            <w:tcW w:type="dxa" w:w="7257"/>
-            <w:vAlign w:val="center"/>
-          </w:tcPr>
-          <w:p>
-            <w:pPr>
-              <w:spacing w:after="0"/>
-              <w:jc w:val="left"/>
-            </w:pPr>
-            <w:r>
-              <w:rPr>
-                <w:rFonts w:ascii="Poppins" w:hAnsi="Poppins" w:eastAsia="Poppins"/>
-                <w:b w:val="0"/>
-                <w:i w:val="0"/>
-                <w:color w:val="2A2620"/>
-                <w:sz w:val="17"/>
-              </w:rPr>
-              <w:t>Sra. Mabel Torrico</w:t>
+              <w:t>M.T. BAT Sociedad Anónima — representante: Sra. Mabel Torrico</w:t>
             </w:r>
           </w:p>
         </w:tc>
@@ -311,7 +251,7 @@
                 <w:color w:val="2A2620"/>
                 <w:sz w:val="17"/>
               </w:rPr>
-              <w:t>Edificio mixto de departamentos y locales comerciales — Avda. República Argentina esquina Tobatí, Asunción — Cuenta Corriente Catastral N.º 14-0322-17</w:t>
+              <w:t>Edificio Inox, edificio mixto de departamentos y locales comerciales — Avda. República Argentina esquina Tobatí, Asunción — Cta. Cte. Catastral N.º 14-0322-17</w:t>
             </w:r>
           </w:p>
         </w:tc>
@@ -361,7 +301,7 @@
                 <w:color w:val="2A2620"/>
                 <w:sz w:val="17"/>
               </w:rPr>
-              <w:t>Meridiano Capital</w:t>
+              <w:t>Meridiano Capital, a través de su broker inmobiliario Juan José Castillo</w:t>
             </w:r>
           </w:p>
         </w:tc>
@@ -370,7 +310,7 @@
     <w:p>
       <w:pPr>
         <w:keepNext w:val="0"/>
-        <w:spacing w:before="160" w:after="0" w:line="264" w:lineRule="auto"/>
+        <w:spacing w:before="140" w:after="0" w:line="254" w:lineRule="auto"/>
         <w:jc w:val="left"/>
       </w:pPr>
       <w:r>
@@ -407,7 +347,7 @@
     <w:p>
       <w:pPr>
         <w:keepNext w:val="0"/>
-        <w:spacing w:before="0" w:after="0" w:line="264" w:lineRule="auto"/>
+        <w:spacing w:before="0" w:after="0" w:line="254" w:lineRule="auto"/>
         <w:jc w:val="left"/>
       </w:pPr>
       <w:r>
@@ -416,7 +356,7 @@
           <w:b w:val="0"/>
           <w:i w:val="0"/>
           <w:color w:val="2A2620"/>
-          <w:sz w:val="19"/>
+          <w:sz w:val="18"/>
         </w:rPr>
         <w:t>Presente</w:t>
       </w:r>
@@ -424,7 +364,7 @@
     <w:p>
       <w:pPr>
         <w:keepNext w:val="0"/>
-        <w:spacing w:before="160" w:after="100" w:line="264" w:lineRule="auto"/>
+        <w:spacing w:before="140" w:after="80" w:line="254" w:lineRule="auto"/>
         <w:jc w:val="left"/>
       </w:pPr>
       <w:r>
@@ -433,7 +373,7 @@
           <w:b w:val="0"/>
           <w:i w:val="0"/>
           <w:color w:val="2A2620"/>
-          <w:sz w:val="19"/>
+          <w:sz w:val="18"/>
         </w:rPr>
         <w:t>Señor Matías Manzato:</w:t>
       </w:r>
@@ -441,7 +381,7 @@
     <w:p>
       <w:pPr>
         <w:keepNext w:val="0"/>
-        <w:spacing w:before="0" w:after="120" w:line="264" w:lineRule="auto"/>
+        <w:spacing w:before="0" w:after="100" w:line="254" w:lineRule="auto"/>
         <w:jc w:val="both"/>
       </w:pPr>
       <w:r>
@@ -450,15 +390,15 @@
           <w:b w:val="0"/>
           <w:i w:val="0"/>
           <w:color w:val="2A2620"/>
-          <w:sz w:val="19"/>
+          <w:sz w:val="18"/>
         </w:rPr>
-        <w:t>En relación con su propuesta formal de compra de fecha 16 de octubre de 2026, por USD 700.000, correspondiente al edificio ubicado en Avda. República Argentina esquina Tobatí de Asunción, identificado con Cuenta Corriente Catastral N.º 14-0322-17, propiedad de M.T. BAT Sociedad Anónima, cuya representante identificada es la señora Mabel Torrico, Meridiano Capital, en su carácter de inmobiliaria colocadora, canaliza la respuesta comunicada por la parte vendedora.</w:t>
+        <w:t>En relación con su propuesta formal de compra de fecha 16 de octubre de 2026, por USD 700.000, correspondiente al Edificio Inox, ubicado en Avda. República Argentina esquina Tobatí de Asunción, identificado con Cuenta Corriente Catastral N.º 14-0322-17, propiedad de M.T. BAT Sociedad Anónima, cuya representante identificada es la señora Mabel Torrico, Meridiano Capital, a través de su broker inmobiliario Juan José Castillo, en su carácter de inmobiliaria colocadora, canaliza la respuesta comunicada por la parte vendedora.</w:t>
       </w:r>
     </w:p>
     <w:p>
       <w:pPr>
         <w:keepNext w:val="0"/>
-        <w:spacing w:before="0" w:after="120" w:line="264" w:lineRule="auto"/>
+        <w:spacing w:before="0" w:after="100" w:line="254" w:lineRule="auto"/>
         <w:jc w:val="both"/>
       </w:pPr>
       <w:r>
@@ -467,15 +407,15 @@
           <w:b w:val="0"/>
           <w:i w:val="0"/>
           <w:color w:val="2A2620"/>
-          <w:sz w:val="19"/>
+          <w:sz w:val="18"/>
         </w:rPr>
-        <w:t>En consideración de los presupuestos y las necesidades de remodelación planteadas por la parte compradora para la regularización de planos y los arreglos básicos del edificio, la parte vendedora acepta reducir el precio de venta a USD 820.000 (ochocientos veinte mil dólares estadounidenses), conforme a las condiciones que se detallan a continuación.</w:t>
+        <w:t>Su presentación como interesado consta en la carta de presentación de cliente y reconocimiento de comisión por intermediación dirigida a la parte vendedora, en la que se deja constancia de la intermediación de ambos asesores inmobiliarios intervinientes: la señora Lourdes Baratto y Meridiano Capital, a través de su broker inmobiliario Juan José Castillo.</w:t>
       </w:r>
     </w:p>
     <w:p>
       <w:pPr>
         <w:keepNext w:val="0"/>
-        <w:spacing w:before="0" w:after="120" w:line="264" w:lineRule="auto"/>
+        <w:spacing w:before="0" w:after="120" w:line="254" w:lineRule="auto"/>
         <w:jc w:val="both"/>
       </w:pPr>
       <w:r>
@@ -484,15 +424,15 @@
           <w:b w:val="0"/>
           <w:i w:val="0"/>
           <w:color w:val="2A2620"/>
-          <w:sz w:val="19"/>
+          <w:sz w:val="18"/>
         </w:rPr>
-        <w:t>La reducción toma en cuenta los trabajos planteados por usted; no implica que la parte vendedora asuma la ejecución ni el costo de dichas reformas o regularizaciones. Esta comunicación no constituye la aceptación de la propuesta de USD 700.000 ni perfecciona una compraventa: transmite la contraoferta de la parte vendedora para su consideración.</w:t>
+        <w:t>En consideración de los presupuestos y las necesidades de remodelación planteadas por la parte compradora para la regularización de planos y los arreglos básicos del edificio, la parte vendedora acepta reducir el precio de venta a USD 820.000 (ochocientos veinte mil dólares estadounidenses), conforme a las condiciones que se detallan a continuación. La reducción no implica que la parte vendedora asuma la ejecución ni el costo de dichas reformas o regularizaciones.</w:t>
       </w:r>
     </w:p>
     <w:p>
       <w:pPr>
         <w:keepNext/>
-        <w:spacing w:before="0" w:after="100" w:line="264" w:lineRule="auto"/>
+        <w:spacing w:before="0" w:after="80" w:line="254" w:lineRule="auto"/>
         <w:jc w:val="both"/>
       </w:pPr>
       <w:r>
@@ -531,17 +471,17 @@
         </w:tblBorders>
         <w:tblLayout w:type="fixed"/>
         <w:tblCellMar>
-          <w:top w:w="35" w:type="dxa"/>
-          <w:bottom w:w="35" w:type="dxa"/>
+          <w:top w:w="30" w:type="dxa"/>
+          <w:bottom w:w="30" w:type="dxa"/>
           <w:left w:w="110" w:type="dxa"/>
           <w:right w:w="110" w:type="dxa"/>
         </w:tblCellMar>
         <w:tblLayout w:type="fixed"/>
       </w:tblPr>
       <w:tblGrid>
-        <w:gridCol w:w="3402"/>
-        <w:gridCol w:w="4309"/>
-        <w:gridCol w:w="1928"/>
+        <w:gridCol w:w="2608"/>
+        <w:gridCol w:w="5216"/>
+        <w:gridCol w:w="1814"/>
       </w:tblGrid>
       <w:tr>
         <w:trPr>
@@ -549,7 +489,7 @@
         </w:trPr>
         <w:tc>
           <w:tcPr>
-            <w:tcW w:type="dxa" w:w="3402"/>
+            <w:tcW w:type="dxa" w:w="2608"/>
             <w:shd w:val="clear" w:color="auto" w:fill="14313A"/>
             <w:vAlign w:val="center"/>
           </w:tcPr>
@@ -573,7 +513,7 @@
         </w:tc>
         <w:tc>
           <w:tcPr>
-            <w:tcW w:type="dxa" w:w="4309"/>
+            <w:tcW w:type="dxa" w:w="5216"/>
             <w:shd w:val="clear" w:color="auto" w:fill="14313A"/>
             <w:vAlign w:val="center"/>
           </w:tcPr>
@@ -591,13 +531,13 @@
                 <w:color w:val="FFFFFF"/>
                 <w:sz w:val="15"/>
               </w:rPr>
-              <w:t>OPORTUNIDAD</w:t>
+              <w:t>OPORTUNIDAD Y FORMA DE PAGO</w:t>
             </w:r>
           </w:p>
         </w:tc>
         <w:tc>
           <w:tcPr>
-            <w:tcW w:type="dxa" w:w="1928"/>
+            <w:tcW w:type="dxa" w:w="1814"/>
             <w:shd w:val="clear" w:color="auto" w:fill="14313A"/>
             <w:vAlign w:val="center"/>
           </w:tcPr>
@@ -626,7 +566,7 @@
         </w:trPr>
         <w:tc>
           <w:tcPr>
-            <w:tcW w:type="dxa" w:w="3402"/>
+            <w:tcW w:type="dxa" w:w="2608"/>
             <w:vAlign w:val="center"/>
           </w:tcPr>
           <w:p>
@@ -643,12 +583,13 @@
                 <w:color w:val="14313A"/>
                 <w:sz w:val="18"/>
               </w:rPr>
-              <w:t>Entrega inicial a cuenta del precio</w:t>
+              <w:t>Reserva</w:t>
             </w:r>
           </w:p>
           <w:p>
             <w:pPr>
               <w:keepNext/>
+              <w:spacing w:after="0"/>
             </w:pPr>
             <w:r>
               <w:rPr>
@@ -658,13 +599,13 @@
                 <w:color w:val="6B6154"/>
                 <w:sz w:val="15"/>
               </w:rPr>
-              <w:t>Doscientos cincuenta mil dólares estadounidenses</w:t>
+              <w:t>Ochenta y dos mil dólares estadounidenses</w:t>
             </w:r>
           </w:p>
         </w:tc>
         <w:tc>
           <w:tcPr>
-            <w:tcW w:type="dxa" w:w="4309"/>
+            <w:tcW w:type="dxa" w:w="5216"/>
             <w:vAlign w:val="center"/>
           </w:tcPr>
           <w:p>
@@ -679,15 +620,15 @@
                 <w:b w:val="0"/>
                 <w:i w:val="0"/>
                 <w:color w:val="2A2620"/>
-                <w:sz w:val="18"/>
+                <w:sz w:val="17"/>
               </w:rPr>
-              <w:t>A la aceptación de la presente contraoferta</w:t>
+              <w:t>Una vez aceptada la presente propuesta, mediante transferencia bancaria a la cuenta que indique la parte vendedora</w:t>
             </w:r>
           </w:p>
         </w:tc>
         <w:tc>
           <w:tcPr>
-            <w:tcW w:type="dxa" w:w="1928"/>
+            <w:tcW w:type="dxa" w:w="1814"/>
             <w:vAlign w:val="center"/>
           </w:tcPr>
           <w:p>
@@ -704,7 +645,7 @@
                 <w:color w:val="14313A"/>
                 <w:sz w:val="19"/>
               </w:rPr>
-              <w:t>USD 250.000</w:t>
+              <w:t>USD 82.000</w:t>
             </w:r>
           </w:p>
         </w:tc>
@@ -715,7 +656,7 @@
         </w:trPr>
         <w:tc>
           <w:tcPr>
-            <w:tcW w:type="dxa" w:w="3402"/>
+            <w:tcW w:type="dxa" w:w="2608"/>
             <w:shd w:val="clear" w:color="auto" w:fill="F7F4EE"/>
             <w:vAlign w:val="center"/>
           </w:tcPr>
@@ -733,12 +674,105 @@
                 <w:color w:val="14313A"/>
                 <w:sz w:val="18"/>
               </w:rPr>
-              <w:t>Saldo de precio</w:t>
+              <w:t>Seña de trato</w:t>
             </w:r>
           </w:p>
           <w:p>
             <w:pPr>
               <w:keepNext/>
+              <w:spacing w:after="0"/>
+            </w:pPr>
+            <w:r>
+              <w:rPr>
+                <w:rFonts w:ascii="Poppins" w:hAnsi="Poppins" w:eastAsia="Poppins"/>
+                <w:b w:val="0"/>
+                <w:i/>
+                <w:color w:val="6B6154"/>
+                <w:sz w:val="15"/>
+              </w:rPr>
+              <w:t>Ciento sesenta y ocho mil dólares estadounidenses</w:t>
+            </w:r>
+          </w:p>
+        </w:tc>
+        <w:tc>
+          <w:tcPr>
+            <w:tcW w:type="dxa" w:w="5216"/>
+            <w:shd w:val="clear" w:color="auto" w:fill="F7F4EE"/>
+            <w:vAlign w:val="center"/>
+          </w:tcPr>
+          <w:p>
+            <w:pPr>
+              <w:keepNext/>
+              <w:spacing w:after="0"/>
+              <w:jc w:val="left"/>
+            </w:pPr>
+            <w:r>
+              <w:rPr>
+                <w:rFonts w:ascii="Poppins" w:hAnsi="Poppins" w:eastAsia="Poppins"/>
+                <w:b w:val="0"/>
+                <w:i w:val="0"/>
+                <w:color w:val="2A2620"/>
+                <w:sz w:val="17"/>
+              </w:rPr>
+              <w:t>A la firma del contrato privado de compraventa en escribanía, en un lapso no mayor a 30 días corridos desde la reserva, mediante transferencia bancaria</w:t>
+            </w:r>
+          </w:p>
+        </w:tc>
+        <w:tc>
+          <w:tcPr>
+            <w:tcW w:type="dxa" w:w="1814"/>
+            <w:shd w:val="clear" w:color="auto" w:fill="F7F4EE"/>
+            <w:vAlign w:val="center"/>
+          </w:tcPr>
+          <w:p>
+            <w:pPr>
+              <w:keepNext/>
+              <w:spacing w:after="0"/>
+              <w:jc w:val="right"/>
+            </w:pPr>
+            <w:r>
+              <w:rPr>
+                <w:rFonts w:ascii="Poppins" w:hAnsi="Poppins" w:eastAsia="Poppins"/>
+                <w:b/>
+                <w:i w:val="0"/>
+                <w:color w:val="14313A"/>
+                <w:sz w:val="19"/>
+              </w:rPr>
+              <w:t>USD 168.000</w:t>
+            </w:r>
+          </w:p>
+        </w:tc>
+      </w:tr>
+      <w:tr>
+        <w:trPr>
+          <w:cantSplit/>
+        </w:trPr>
+        <w:tc>
+          <w:tcPr>
+            <w:tcW w:type="dxa" w:w="2608"/>
+            <w:vAlign w:val="center"/>
+          </w:tcPr>
+          <w:p>
+            <w:pPr>
+              <w:keepNext/>
+              <w:spacing w:after="0"/>
+              <w:jc w:val="left"/>
+            </w:pPr>
+            <w:r>
+              <w:rPr>
+                <w:rFonts w:ascii="Poppins" w:hAnsi="Poppins" w:eastAsia="Poppins"/>
+                <w:b/>
+                <w:i w:val="0"/>
+                <w:color w:val="14313A"/>
+                <w:sz w:val="18"/>
+              </w:rPr>
+              <w:t>Saldo de la operación</w:t>
+            </w:r>
+          </w:p>
+          <w:p>
+            <w:pPr>
+              <w:keepNext/>
+              <w:spacing w:after="0"/>
             </w:pPr>
             <w:r>
               <w:rPr>
@@ -754,8 +788,7 @@
         </w:tc>
         <w:tc>
           <w:tcPr>
-            <w:tcW w:type="dxa" w:w="4309"/>
-            <w:shd w:val="clear" w:color="auto" w:fill="F7F4EE"/>
+            <w:tcW w:type="dxa" w:w="5216"/>
             <w:vAlign w:val="center"/>
           </w:tcPr>
           <w:p>
@@ -770,16 +803,15 @@
                 <w:b w:val="0"/>
                 <w:i w:val="0"/>
                 <w:color w:val="2A2620"/>
-                <w:sz w:val="18"/>
+                <w:sz w:val="17"/>
               </w:rPr>
-              <w:t>Contra la firma de la escritura pública traslativa de dominio</w:t>
+              <w:t>A la firma de la escritura traslativa de dominio en escribanía, en un lapso de 180 días hábiles a partir de la seña de trato, mediante transferencia bancaria</w:t>
             </w:r>
           </w:p>
         </w:tc>
         <w:tc>
           <w:tcPr>
-            <w:tcW w:type="dxa" w:w="1928"/>
-            <w:shd w:val="clear" w:color="auto" w:fill="F7F4EE"/>
+            <w:tcW w:type="dxa" w:w="1814"/>
             <w:vAlign w:val="center"/>
           </w:tcPr>
           <w:p>
@@ -807,7 +839,7 @@
         </w:trPr>
         <w:tc>
           <w:tcPr>
-            <w:tcW w:type="dxa" w:w="3402"/>
+            <w:tcW w:type="dxa" w:w="2608"/>
             <w:shd w:val="clear" w:color="auto" w:fill="F3EDE3"/>
             <w:vAlign w:val="center"/>
           </w:tcPr>
@@ -830,7 +862,7 @@
         </w:tc>
         <w:tc>
           <w:tcPr>
-            <w:tcW w:type="dxa" w:w="4309"/>
+            <w:tcW w:type="dxa" w:w="5216"/>
             <w:shd w:val="clear" w:color="auto" w:fill="F3EDE3"/>
             <w:vAlign w:val="center"/>
           </w:tcPr>
@@ -853,7 +885,7 @@
         </w:tc>
         <w:tc>
           <w:tcPr>
-            <w:tcW w:type="dxa" w:w="1928"/>
+            <w:tcW w:type="dxa" w:w="1814"/>
             <w:shd w:val="clear" w:color="auto" w:fill="F3EDE3"/>
             <w:vAlign w:val="center"/>
           </w:tcPr>
@@ -879,7 +911,7 @@
     <w:p>
       <w:pPr>
         <w:keepNext w:val="0"/>
-        <w:spacing w:before="100" w:after="120" w:line="264" w:lineRule="auto"/>
+        <w:spacing w:before="80" w:after="120" w:line="254" w:lineRule="auto"/>
         <w:jc w:val="both"/>
       </w:pPr>
       <w:r>
@@ -888,15 +920,15 @@
           <w:b w:val="0"/>
           <w:i w:val="0"/>
           <w:color w:val="2A2620"/>
-          <w:sz w:val="19"/>
+          <w:sz w:val="18"/>
         </w:rPr>
-        <w:t>La entrega inicial se imputa íntegramente al precio. El saldo de USD 570.000 sustituye al saldo de USD 450.000 previsto en su propuesta. Las condiciones de la entrega inicial —receptor, medio de pago y tratamiento— deberán acordarse por escrito entre las partes antes de su desembolso.</w:t>
+        <w:t>La reserva y la seña de trato se imputan íntegramente al precio. El saldo de USD 570.000 sustituye al saldo de USD 450.000 previsto en su propuesta.</w:t>
       </w:r>
     </w:p>
     <w:p>
       <w:pPr>
         <w:keepNext/>
-        <w:spacing w:before="0" w:after="100" w:line="264" w:lineRule="auto"/>
+        <w:spacing w:before="0" w:after="80" w:line="254" w:lineRule="auto"/>
         <w:jc w:val="both"/>
       </w:pPr>
       <w:r>
@@ -907,7 +939,7 @@
           <w:color w:val="14313A"/>
           <w:sz w:val="19"/>
         </w:rPr>
-        <w:t>Condiciones de la contraoferta</w:t>
+        <w:t>Condiciones de la operación</w:t>
       </w:r>
     </w:p>
     <w:p>
@@ -916,7 +948,7 @@
         <w:tabs>
           <w:tab w:pos="425" w:val="left"/>
         </w:tabs>
-        <w:spacing w:before="0" w:after="80" w:line="264" w:lineRule="auto"/>
+        <w:spacing w:before="0" w:after="60" w:line="254" w:lineRule="auto"/>
         <w:ind w:left="425" w:hanging="425"/>
         <w:jc w:val="both"/>
       </w:pPr>
@@ -926,7 +958,7 @@
           <w:b/>
           <w:i w:val="0"/>
           <w:color w:val="A87D22"/>
-          <w:sz w:val="19"/>
+          <w:sz w:val="18"/>
         </w:rPr>
         <w:t>2.</w:t>
         <w:tab/>
@@ -937,7 +969,7 @@
           <w:b/>
           <w:i w:val="0"/>
           <w:color w:val="14313A"/>
-          <w:sz w:val="19"/>
+          <w:sz w:val="18"/>
         </w:rPr>
         <w:t xml:space="preserve">Comisión inmobiliaria. </w:t>
       </w:r>
@@ -947,9 +979,9 @@
           <w:b w:val="0"/>
           <w:i w:val="0"/>
           <w:color w:val="2A2620"/>
-          <w:sz w:val="19"/>
+          <w:sz w:val="18"/>
         </w:rPr>
-        <w:t>La comisión inmobiliaria será del 5,5 % (cinco coma cinco por ciento), a cargo de la parte vendedora.</w:t>
+        <w:t>La comisión inmobiliaria del 5,5 % (cinco coma cinco por ciento) será abonada en un 100 % por la parte vendedora.</w:t>
       </w:r>
     </w:p>
     <w:p>
@@ -958,7 +990,7 @@
         <w:tabs>
           <w:tab w:pos="425" w:val="left"/>
         </w:tabs>
-        <w:spacing w:before="0" w:after="80" w:line="264" w:lineRule="auto"/>
+        <w:spacing w:before="0" w:after="60" w:line="254" w:lineRule="auto"/>
         <w:ind w:left="425" w:hanging="425"/>
         <w:jc w:val="both"/>
       </w:pPr>
@@ -968,7 +1000,7 @@
           <w:b/>
           <w:i w:val="0"/>
           <w:color w:val="A87D22"/>
-          <w:sz w:val="19"/>
+          <w:sz w:val="18"/>
         </w:rPr>
         <w:t>3.</w:t>
         <w:tab/>
@@ -979,9 +1011,9 @@
           <w:b/>
           <w:i w:val="0"/>
           <w:color w:val="14313A"/>
-          <w:sz w:val="19"/>
+          <w:sz w:val="18"/>
         </w:rPr>
-        <w:t xml:space="preserve">Gastos de escrituración. </w:t>
+        <w:t xml:space="preserve">Gastos de transferencia. </w:t>
       </w:r>
       <w:r>
         <w:rPr>
@@ -989,9 +1021,9 @@
           <w:b w:val="0"/>
           <w:i w:val="0"/>
           <w:color w:val="2A2620"/>
-          <w:sz w:val="19"/>
+          <w:sz w:val="18"/>
         </w:rPr>
-        <w:t>Los gastos de escrituración serán soportados en un 50 % por la parte compradora y en un 50 % por la parte vendedora. Este reparto se refiere únicamente a los gastos de escrituración y es independiente de los impuestos indicados en el punto siguiente.</w:t>
+        <w:t>Los gastos de transferencia serán pagados en un 50 % por la parte compradora y en un 50 % por la parte vendedora. Este reparto es independiente de los impuestos indicados en los puntos siguientes.</w:t>
       </w:r>
     </w:p>
     <w:p>
@@ -1000,7 +1032,7 @@
         <w:tabs>
           <w:tab w:pos="425" w:val="left"/>
         </w:tabs>
-        <w:spacing w:before="0" w:after="80" w:line="264" w:lineRule="auto"/>
+        <w:spacing w:before="0" w:after="60" w:line="254" w:lineRule="auto"/>
         <w:ind w:left="425" w:hanging="425"/>
         <w:jc w:val="both"/>
       </w:pPr>
@@ -1010,7 +1042,7 @@
           <w:b/>
           <w:i w:val="0"/>
           <w:color w:val="A87D22"/>
-          <w:sz w:val="19"/>
+          <w:sz w:val="18"/>
         </w:rPr>
         <w:t>4.</w:t>
         <w:tab/>
@@ -1021,9 +1053,9 @@
           <w:b/>
           <w:i w:val="0"/>
           <w:color w:val="14313A"/>
-          <w:sz w:val="19"/>
+          <w:sz w:val="18"/>
         </w:rPr>
-        <w:t xml:space="preserve">Impuestos de la operación. </w:t>
+        <w:t xml:space="preserve">IVA. </w:t>
       </w:r>
       <w:r>
         <w:rPr>
@@ -1031,9 +1063,9 @@
           <w:b w:val="0"/>
           <w:i w:val="0"/>
           <w:color w:val="2A2620"/>
-          <w:sz w:val="19"/>
+          <w:sz w:val="18"/>
         </w:rPr>
-        <w:t>El IVA correspondiente a la venta y los demás impuestos que correspondan a la transferencia estarán a cargo de la parte vendedora. Estos conceptos no se adicionan al precio de USD 820.000.</w:t>
+        <w:t>El IVA correspondiente a la venta del inmueble, a la tasa del 5 % aplicable a la enajenación de inmuebles, será pagado por la parte vendedora, como lo establece la ley. No se adiciona al precio de USD 820.000.</w:t>
       </w:r>
     </w:p>
     <w:p>
@@ -1042,7 +1074,7 @@
         <w:tabs>
           <w:tab w:pos="425" w:val="left"/>
         </w:tabs>
-        <w:spacing w:before="0" w:after="80" w:line="264" w:lineRule="auto"/>
+        <w:spacing w:before="0" w:after="60" w:line="254" w:lineRule="auto"/>
         <w:ind w:left="425" w:hanging="425"/>
         <w:jc w:val="both"/>
       </w:pPr>
@@ -1052,7 +1084,7 @@
           <w:b/>
           <w:i w:val="0"/>
           <w:color w:val="A87D22"/>
-          <w:sz w:val="19"/>
+          <w:sz w:val="18"/>
         </w:rPr>
         <w:t>5.</w:t>
         <w:tab/>
@@ -1063,7 +1095,91 @@
           <w:b/>
           <w:i w:val="0"/>
           <w:color w:val="14313A"/>
-          <w:sz w:val="19"/>
+          <w:sz w:val="18"/>
+        </w:rPr>
+        <w:t xml:space="preserve">Impuestos inmobiliarios. </w:t>
+      </w:r>
+      <w:r>
+        <w:rPr>
+          <w:rFonts w:ascii="Poppins" w:hAnsi="Poppins" w:eastAsia="Poppins"/>
+          <w:b w:val="0"/>
+          <w:i w:val="0"/>
+          <w:color w:val="2A2620"/>
+          <w:sz w:val="18"/>
+        </w:rPr>
+        <w:t>Los impuestos inmobiliarios deben estar al día, a cargo de la parte vendedora, como lo establece la ley.</w:t>
+      </w:r>
+    </w:p>
+    <w:p>
+      <w:pPr>
+        <w:keepNext w:val="0"/>
+        <w:tabs>
+          <w:tab w:pos="425" w:val="left"/>
+        </w:tabs>
+        <w:spacing w:before="0" w:after="60" w:line="254" w:lineRule="auto"/>
+        <w:ind w:left="425" w:hanging="425"/>
+        <w:jc w:val="both"/>
+      </w:pPr>
+      <w:r>
+        <w:rPr>
+          <w:rFonts w:ascii="Poppins" w:hAnsi="Poppins" w:eastAsia="Poppins"/>
+          <w:b/>
+          <w:i w:val="0"/>
+          <w:color w:val="A87D22"/>
+          <w:sz w:val="18"/>
+        </w:rPr>
+        <w:t>6.</w:t>
+        <w:tab/>
+      </w:r>
+      <w:r>
+        <w:rPr>
+          <w:rFonts w:ascii="Poppins" w:hAnsi="Poppins" w:eastAsia="Poppins"/>
+          <w:b/>
+          <w:i w:val="0"/>
+          <w:color w:val="14313A"/>
+          <w:sz w:val="18"/>
+        </w:rPr>
+        <w:t xml:space="preserve">Aprobación bancaria. </w:t>
+      </w:r>
+      <w:r>
+        <w:rPr>
+          <w:rFonts w:ascii="Poppins" w:hAnsi="Poppins" w:eastAsia="Poppins"/>
+          <w:b w:val="0"/>
+          <w:i w:val="0"/>
+          <w:color w:val="2A2620"/>
+          <w:sz w:val="18"/>
+        </w:rPr>
+        <w:t>Toda la operación y las transferencias estarán sujetas a la aprobación del banco interviniente. La parte vendedora se compromete a facilitar y gestionar, de común acuerdo, toda la información y documentación necesaria que soliciten los bancos intervinientes en las transferencias.</w:t>
+      </w:r>
+    </w:p>
+    <w:p>
+      <w:pPr>
+        <w:keepNext w:val="0"/>
+        <w:tabs>
+          <w:tab w:pos="425" w:val="left"/>
+        </w:tabs>
+        <w:spacing w:before="0" w:after="60" w:line="254" w:lineRule="auto"/>
+        <w:ind w:left="425" w:hanging="425"/>
+        <w:jc w:val="both"/>
+      </w:pPr>
+      <w:r>
+        <w:rPr>
+          <w:rFonts w:ascii="Poppins" w:hAnsi="Poppins" w:eastAsia="Poppins"/>
+          <w:b/>
+          <w:i w:val="0"/>
+          <w:color w:val="A87D22"/>
+          <w:sz w:val="18"/>
+        </w:rPr>
+        <w:t>7.</w:t>
+        <w:tab/>
+      </w:r>
+      <w:r>
+        <w:rPr>
+          <w:rFonts w:ascii="Poppins" w:hAnsi="Poppins" w:eastAsia="Poppins"/>
+          <w:b/>
+          <w:i w:val="0"/>
+          <w:color w:val="14313A"/>
+          <w:sz w:val="18"/>
         </w:rPr>
         <w:t xml:space="preserve">Acompañamiento de transición. </w:t>
       </w:r>
@@ -1073,7 +1189,7 @@
           <w:b w:val="0"/>
           <w:i w:val="0"/>
           <w:color w:val="2A2620"/>
-          <w:sz w:val="19"/>
+          <w:sz w:val="18"/>
         </w:rPr>
         <w:t>La parte vendedora se compromete a acompañar a la parte compradora durante seis (6) meses desde la compra, brindando toda la información y el conocimiento necesarios para el traspaso de la documentación y de la gestión de locación del edificio. Este acompañamiento tiene carácter informativo y de transición; no constituye garantía de renta, administración del edificio, cobranza ni responsabilidad por las decisiones futuras de la parte compradora.</w:t>
       </w:r>
@@ -1084,7 +1200,7 @@
         <w:tabs>
           <w:tab w:pos="425" w:val="left"/>
         </w:tabs>
-        <w:spacing w:before="0" w:after="80" w:line="264" w:lineRule="auto"/>
+        <w:spacing w:before="0" w:after="60" w:line="254" w:lineRule="auto"/>
         <w:ind w:left="425" w:hanging="425"/>
         <w:jc w:val="both"/>
       </w:pPr>
@@ -1094,9 +1210,9 @@
           <w:b/>
           <w:i w:val="0"/>
           <w:color w:val="A87D22"/>
-          <w:sz w:val="19"/>
+          <w:sz w:val="18"/>
         </w:rPr>
-        <w:t>6.</w:t>
+        <w:t>8.</w:t>
         <w:tab/>
       </w:r>
       <w:r>
@@ -1105,7 +1221,7 @@
           <w:b/>
           <w:i w:val="0"/>
           <w:color w:val="14313A"/>
-          <w:sz w:val="19"/>
+          <w:sz w:val="18"/>
         </w:rPr>
         <w:t xml:space="preserve">Verificación documental. </w:t>
       </w:r>
@@ -1115,9 +1231,9 @@
           <w:b w:val="0"/>
           <w:i w:val="0"/>
           <w:color w:val="2A2620"/>
-          <w:sz w:val="19"/>
+          <w:sz w:val="18"/>
         </w:rPr>
-        <w:t>Conforme a su propuesta, la operación continúa sujeta a la verificación de la documentación de dominio del inmueble y de que este se encuentre libre de gravámenes. La presente no implica que dicha verificación ya se haya realizado, ni renuncia alguna de la parte compradora a revisar el inmueble.</w:t>
+        <w:t>Conforme a su propuesta, la operación continúa sujeta a la verificación de la documentación de dominio del inmueble y de que este se encuentre libre de gravámenes, sin que la presente implique que dicha verificación ya se haya realizado.</w:t>
       </w:r>
     </w:p>
     <w:p>
@@ -1126,7 +1242,7 @@
         <w:tabs>
           <w:tab w:pos="425" w:val="left"/>
         </w:tabs>
-        <w:spacing w:before="0" w:after="80" w:line="264" w:lineRule="auto"/>
+        <w:spacing w:before="0" w:after="60" w:line="254" w:lineRule="auto"/>
         <w:ind w:left="425" w:hanging="425"/>
         <w:jc w:val="both"/>
       </w:pPr>
@@ -1136,9 +1252,9 @@
           <w:b/>
           <w:i w:val="0"/>
           <w:color w:val="A87D22"/>
-          <w:sz w:val="19"/>
+          <w:sz w:val="18"/>
         </w:rPr>
-        <w:t>7.</w:t>
+        <w:t>9.</w:t>
         <w:tab/>
       </w:r>
       <w:r>
@@ -1147,7 +1263,7 @@
           <w:b/>
           <w:i w:val="0"/>
           <w:color w:val="14313A"/>
-          <w:sz w:val="19"/>
+          <w:sz w:val="18"/>
         </w:rPr>
         <w:t xml:space="preserve">Formalización. </w:t>
       </w:r>
@@ -1157,9 +1273,9 @@
           <w:b w:val="0"/>
           <w:i w:val="0"/>
           <w:color w:val="2A2620"/>
-          <w:sz w:val="19"/>
+          <w:sz w:val="18"/>
         </w:rPr>
-        <w:t>Las condiciones aquí comunicadas deberán instrumentarse por escrito y ser suscritas por la parte compradora y por la parte vendedora, esta última por medio de quien acredite facultades suficientes. Meridiano Capital, en su carácter de inmobiliaria colocadora, canaliza esta respuesta sin ejercer representación legal de ninguna de las partes ni obligar a M.T. BAT Sociedad Anónima.</w:t>
+        <w:t>Las condiciones aquí comunicadas deberán instrumentarse por escrito y ser suscritas por la parte compradora y por la parte vendedora, esta última por medio de quien acredite facultades suficientes. Meridiano Capital, a través de su broker inmobiliario Juan José Castillo, en su carácter de inmobiliaria colocadora, canaliza esta respuesta sin ejercer representación legal de ninguna de las partes ni obligar a M.T. BAT Sociedad Anónima.</w:t>
       </w:r>
     </w:p>
     <w:tbl>
@@ -1174,8 +1290,8 @@
         </w:tblBorders>
         <w:tblLayout w:type="fixed"/>
         <w:tblCellMar>
-          <w:top w:w="50" w:type="dxa"/>
-          <w:bottom w:w="50" w:type="dxa"/>
+          <w:top w:w="45" w:type="dxa"/>
+          <w:bottom w:w="45" w:type="dxa"/>
           <w:left w:w="140" w:type="dxa"/>
           <w:right w:w="140" w:type="dxa"/>
         </w:tblCellMar>
@@ -1202,17 +1318,17 @@
                 <w:color w:val="14313A"/>
                 <w:sz w:val="19"/>
               </w:rPr>
-              <w:t xml:space="preserve">Vigencia de esta contraoferta: </w:t>
+              <w:t xml:space="preserve">Vigencia: </w:t>
             </w:r>
             <w:r>
               <w:rPr>
                 <w:rFonts w:ascii="Poppins" w:hAnsi="Poppins" w:eastAsia="Poppins"/>
-                <w:b/>
+                <w:b w:val="0"/>
                 <w:i w:val="0"/>
-                <w:color w:val="A87D22"/>
+                <w:color w:val="2A2620"/>
                 <w:sz w:val="19"/>
               </w:rPr>
-              <w:t>[pendiente de confirmación]</w:t>
+              <w:t>la presente propuesta tiene una validez de 30 días hábiles a partir de su fecha de emisión (23 de octubre de 2026).</w:t>
             </w:r>
           </w:p>
         </w:tc>
@@ -1221,7 +1337,7 @@
     <w:p>
       <w:pPr>
         <w:keepNext/>
-        <w:spacing w:before="160" w:after="80" w:line="264" w:lineRule="auto"/>
+        <w:spacing w:before="140" w:after="400" w:line="254" w:lineRule="auto"/>
         <w:jc w:val="left"/>
       </w:pPr>
       <w:r>
@@ -1230,32 +1346,15 @@
           <w:b w:val="0"/>
           <w:i w:val="0"/>
           <w:color w:val="2A2620"/>
-          <w:sz w:val="19"/>
+          <w:sz w:val="18"/>
         </w:rPr>
-        <w:t>Quedamos a su disposición para recibir su conformidad y coordinar con ambas partes los pasos de instrumentación de la operación, junto con los profesionales que intervengan en su formalización.</w:t>
+        <w:t>Quedamos a su disposición para recibir su conformidad y coordinar con ambas partes los pasos de instrumentación de la operación, junto con los profesionales que intervengan en su formalización. Esperando una respuesta favorable, le saludamos muy atentamente.</w:t>
       </w:r>
     </w:p>
     <w:p>
       <w:pPr>
         <w:keepNext/>
-        <w:spacing w:before="0" w:after="440" w:line="264" w:lineRule="auto"/>
-        <w:jc w:val="left"/>
-      </w:pPr>
-      <w:r>
-        <w:rPr>
-          <w:rFonts w:ascii="Poppins" w:hAnsi="Poppins" w:eastAsia="Poppins"/>
-          <w:b w:val="0"/>
-          <w:i w:val="0"/>
-          <w:color w:val="2A2620"/>
-          <w:sz w:val="19"/>
-        </w:rPr>
-        <w:t>Agradecemos la confianza depositada en Meridiano Capital y le saludamos muy atentamente.</w:t>
-      </w:r>
-    </w:p>
-    <w:p>
-      <w:pPr>
-        <w:keepNext/>
-        <w:spacing w:before="0" w:after="0" w:line="264" w:lineRule="auto"/>
+        <w:spacing w:before="0" w:after="0" w:line="254" w:lineRule="auto"/>
         <w:ind w:left="5556"/>
         <w:jc w:val="left"/>
         <w:pBdr>
@@ -1276,7 +1375,7 @@
     <w:p>
       <w:pPr>
         <w:keepNext/>
-        <w:spacing w:before="0" w:after="0" w:line="264" w:lineRule="auto"/>
+        <w:spacing w:before="0" w:after="0" w:line="254" w:lineRule="auto"/>
         <w:ind w:left="5556"/>
         <w:jc w:val="left"/>
       </w:pPr>
@@ -1294,7 +1393,7 @@
     <w:p>
       <w:pPr>
         <w:keepNext/>
-        <w:spacing w:before="0" w:after="0" w:line="264" w:lineRule="auto"/>
+        <w:spacing w:before="0" w:after="0" w:line="254" w:lineRule="auto"/>
         <w:ind w:left="5556"/>
         <w:jc w:val="left"/>
       </w:pPr>
@@ -1312,7 +1411,7 @@
     <w:p>
       <w:pPr>
         <w:keepNext w:val="0"/>
-        <w:spacing w:before="0" w:after="0" w:line="264" w:lineRule="auto"/>
+        <w:spacing w:before="0" w:after="0" w:line="254" w:lineRule="auto"/>
         <w:ind w:left="5556"/>
         <w:jc w:val="left"/>
       </w:pPr>
@@ -1331,7 +1430,7 @@
       <w:headerReference w:type="default" r:id="rId9"/>
       <w:footerReference w:type="default" r:id="rId10"/>
       <w:pgSz w:w="11906" w:h="16838"/>
-      <w:pgMar w:top="1077" w:right="1134" w:bottom="907" w:left="1134" w:header="454" w:footer="397" w:gutter="0"/>
+      <w:pgMar w:top="1020" w:right="1134" w:bottom="850" w:left="1134" w:header="454" w:footer="397" w:gutter="0"/>
       <w:cols w:space="720"/>
       <w:docGrid w:linePitch="360"/>
     </w:sectPr>
@@ -1486,7 +1585,7 @@
               <w:color w:val="A87D22"/>
               <w:sz w:val="15"/>
             </w:rPr>
-            <w:t>BORRADOR PARA REVISIÓN</w:t>
+            <w:t>EDIFICIO INOX · REPÚBLICA ARGENTINA</w:t>
           </w:r>
         </w:p>
       </w:tc>

</xml_diff>

<commit_message>
REPARG-001: contraoferta v3 con formato del modelo y firmas de todos los intervinientes
- Destinatario una sola vez (se elimina el 'Señor Matías Manzato' duplicado).
- Redacción en frases cortas: se elimina la cadena de incisos 'Meridiano
  Capital, a través de su broker..., en su carácter de..., canaliza...'.
  Toda mención de Meridiano conserva 'a través de su broker inmobiliario
  Juan José Castillo'.
- Formato del modelo de carta de oferta: cuadro de intervinientes, secciones
  en serif, bloque de firmas de vendedora, comprador, broker y asesora con sus
  datos, y página de constancia de recepción + respuesta de la parte
  compradora.
- El PDF modelo (HERRERA-002) no se versiona: contiene PII y la firma de una
  clienta de otra operación.

Co-Authored-By: Claude Opus 5.5 <noreply@anthropic.com>
Claude-Session: https://claude.ai/code/session_013JkVV9TZYdzYDskFW6suGV
</commit_message>
<xml_diff>
--- a/contracts/cases/REPARG-001/client-response/Respuesta_Contraoferta_Republica_Argentina_Meridiano.docx
+++ b/contracts/cases/REPARG-001/client-response/Respuesta_Contraoferta_Republica_Argentina_Meridiano.docx
@@ -5,8 +5,26 @@
     <w:p>
       <w:pPr>
         <w:keepNext w:val="0"/>
-        <w:spacing w:before="0" w:after="20" w:line="254" w:lineRule="auto"/>
-        <w:jc w:val="right"/>
+        <w:spacing w:before="80" w:after="20" w:line="250" w:lineRule="auto"/>
+        <w:jc w:val="center"/>
+      </w:pPr>
+      <w:r>
+        <w:rPr>
+          <w:rFonts w:ascii="Fraunces" w:hAnsi="Fraunces" w:eastAsia="Fraunces"/>
+          <w:b w:val="0"/>
+          <w:i w:val="0"/>
+          <w:color w:val="14313A"/>
+          <w:sz w:val="29"/>
+          <w:spacing w:val="30"/>
+        </w:rPr>
+        <w:t>RESPUESTA A PROPUESTA DE COMPRA Y CONTRAOFERTA</w:t>
+      </w:r>
+    </w:p>
+    <w:p>
+      <w:pPr>
+        <w:keepNext w:val="0"/>
+        <w:spacing w:before="0" w:after="0" w:line="250" w:lineRule="auto"/>
+        <w:jc w:val="center"/>
       </w:pPr>
       <w:r>
         <w:rPr>
@@ -16,69 +34,52 @@
           <w:color w:val="6B6154"/>
           <w:sz w:val="19"/>
         </w:rPr>
+        <w:t>Edificio Inox · Avda. República Argentina esquina Tobatí · Asunción</w:t>
+      </w:r>
+    </w:p>
+    <w:p>
+      <w:pPr>
+        <w:keepNext w:val="0"/>
+        <w:spacing w:before="40" w:after="80" w:line="250" w:lineRule="auto"/>
+        <w:jc w:val="both"/>
+        <w:pBdr>
+          <w:bottom w:val="single" w:sz="4" w:color="DAD2C0"/>
+        </w:pBdr>
+      </w:pPr>
+    </w:p>
+    <w:p>
+      <w:pPr>
+        <w:keepNext w:val="0"/>
+        <w:spacing w:before="0" w:after="0" w:line="250" w:lineRule="auto"/>
+        <w:jc w:val="right"/>
+      </w:pPr>
+      <w:r>
+        <w:rPr>
+          <w:rFonts w:ascii="Poppins" w:hAnsi="Poppins" w:eastAsia="Poppins"/>
+          <w:b w:val="0"/>
+          <w:i w:val="0"/>
+          <w:color w:val="A87D22"/>
+          <w:sz w:val="19"/>
+        </w:rPr>
         <w:t>Asunción, 23 de octubre de 2026</w:t>
       </w:r>
     </w:p>
     <w:p>
       <w:pPr>
         <w:keepNext w:val="0"/>
-        <w:spacing w:before="0" w:after="120" w:line="254" w:lineRule="auto"/>
+        <w:spacing w:before="0" w:after="120" w:line="250" w:lineRule="auto"/>
         <w:jc w:val="right"/>
       </w:pPr>
       <w:r>
         <w:rPr>
           <w:rFonts w:ascii="Poppins" w:hAnsi="Poppins" w:eastAsia="Poppins"/>
           <w:b w:val="0"/>
-          <w:i/>
+          <w:i w:val="0"/>
           <w:color w:val="6B6154"/>
-          <w:sz w:val="17"/>
+          <w:sz w:val="15"/>
         </w:rPr>
-        <w:t>Ref.: Propuesta formal de compra del 16 de octubre de 2026 por USD 700.000</w:t>
+        <w:t>Ref. interna: REPARG-001-CO01 · v3</w:t>
       </w:r>
-    </w:p>
-    <w:p>
-      <w:pPr>
-        <w:keepNext w:val="0"/>
-        <w:spacing w:before="0" w:after="20" w:line="254" w:lineRule="auto"/>
-        <w:jc w:val="left"/>
-      </w:pPr>
-      <w:r>
-        <w:rPr>
-          <w:rFonts w:ascii="Fraunces" w:hAnsi="Fraunces" w:eastAsia="Fraunces"/>
-          <w:b w:val="0"/>
-          <w:i w:val="0"/>
-          <w:color w:val="14313A"/>
-          <w:sz w:val="31"/>
-        </w:rPr>
-        <w:t>RESPUESTA A PROPUESTA DE COMPRA Y CONTRAOFERTA</w:t>
-      </w:r>
-    </w:p>
-    <w:p>
-      <w:pPr>
-        <w:keepNext w:val="0"/>
-        <w:spacing w:before="0" w:after="0" w:line="254" w:lineRule="auto"/>
-        <w:jc w:val="left"/>
-      </w:pPr>
-      <w:r>
-        <w:rPr>
-          <w:rFonts w:ascii="Fraunces" w:hAnsi="Fraunces" w:eastAsia="Fraunces"/>
-          <w:b w:val="0"/>
-          <w:i w:val="0"/>
-          <w:color w:val="A87D22"/>
-          <w:sz w:val="23"/>
-        </w:rPr>
-        <w:t>Edificio Inox — República Argentina esquina Tobatí, Asunción</w:t>
-      </w:r>
-    </w:p>
-    <w:p>
-      <w:pPr>
-        <w:keepNext w:val="0"/>
-        <w:spacing w:before="40" w:after="100" w:line="254" w:lineRule="auto"/>
-        <w:jc w:val="both"/>
-        <w:pBdr>
-          <w:bottom w:val="single" w:sz="6" w:color="C9982E"/>
-        </w:pBdr>
-      </w:pPr>
     </w:p>
     <w:tbl>
       <w:tblPr>
@@ -95,16 +96,16 @@
         </w:tblBorders>
         <w:tblLayout w:type="fixed"/>
         <w:tblCellMar>
-          <w:top w:w="28" w:type="dxa"/>
-          <w:bottom w:w="28" w:type="dxa"/>
+          <w:top w:w="30" w:type="dxa"/>
+          <w:bottom w:w="30" w:type="dxa"/>
           <w:left w:w="110" w:type="dxa"/>
           <w:right w:w="110" w:type="dxa"/>
         </w:tblCellMar>
         <w:tblLayout w:type="fixed"/>
       </w:tblPr>
       <w:tblGrid>
-        <w:gridCol w:w="2381"/>
-        <w:gridCol w:w="7257"/>
+        <w:gridCol w:w="2835"/>
+        <w:gridCol w:w="6803"/>
       </w:tblGrid>
       <w:tr>
         <w:trPr>
@@ -112,8 +113,30 @@
         </w:trPr>
         <w:tc>
           <w:tcPr>
-            <w:tcW w:type="dxa" w:w="2381"/>
-            <w:shd w:val="clear" w:color="auto" w:fill="F3EDE3"/>
+            <w:tcW w:type="dxa" w:w="2835"/>
+            <w:shd w:val="clear" w:color="auto" w:fill="14313A"/>
+            <w:vAlign w:val="center"/>
+          </w:tcPr>
+          <w:p>
+            <w:pPr>
+              <w:spacing w:after="0"/>
+              <w:jc w:val="left"/>
+            </w:pPr>
+            <w:r>
+              <w:rPr>
+                <w:rFonts w:ascii="Poppins" w:hAnsi="Poppins" w:eastAsia="Poppins"/>
+                <w:b/>
+                <w:i w:val="0"/>
+                <w:color w:val="FFFFFF"/>
+                <w:sz w:val="15"/>
+              </w:rPr>
+              <w:t>COMPRADOR / OFERENTE</w:t>
+            </w:r>
+          </w:p>
+        </w:tc>
+        <w:tc>
+          <w:tcPr>
+            <w:tcW w:type="dxa" w:w="6803"/>
             <w:vAlign w:val="center"/>
           </w:tcPr>
           <w:p>
@@ -127,15 +150,21 @@
                 <w:b/>
                 <w:i w:val="0"/>
                 <w:color w:val="14313A"/>
-                <w:sz w:val="15"/>
+                <w:sz w:val="17"/>
               </w:rPr>
-              <w:t>COMPRADOR Y OFERENTE</w:t>
+              <w:t>Matías Manzato · C.I. N.º 9489984</w:t>
             </w:r>
           </w:p>
         </w:tc>
+      </w:tr>
+      <w:tr>
+        <w:trPr>
+          <w:cantSplit/>
+        </w:trPr>
         <w:tc>
           <w:tcPr>
-            <w:tcW w:type="dxa" w:w="7257"/>
+            <w:tcW w:type="dxa" w:w="2835"/>
+            <w:shd w:val="clear" w:color="auto" w:fill="14313A"/>
             <w:vAlign w:val="center"/>
           </w:tcPr>
           <w:p>
@@ -146,24 +175,18 @@
             <w:r>
               <w:rPr>
                 <w:rFonts w:ascii="Poppins" w:hAnsi="Poppins" w:eastAsia="Poppins"/>
-                <w:b w:val="0"/>
+                <w:b/>
                 <w:i w:val="0"/>
-                <w:color w:val="2A2620"/>
-                <w:sz w:val="17"/>
+                <w:color w:val="FFFFFF"/>
+                <w:sz w:val="15"/>
               </w:rPr>
-              <w:t>Matías Manzato — C.I. N.º 9489984</w:t>
+              <w:t>PARTE VENDEDORA</w:t>
             </w:r>
           </w:p>
         </w:tc>
-      </w:tr>
-      <w:tr>
-        <w:trPr>
-          <w:cantSplit/>
-        </w:trPr>
         <w:tc>
           <w:tcPr>
-            <w:tcW w:type="dxa" w:w="2381"/>
-            <w:shd w:val="clear" w:color="auto" w:fill="F3EDE3"/>
+            <w:tcW w:type="dxa" w:w="6803"/>
             <w:vAlign w:val="center"/>
           </w:tcPr>
           <w:p>
@@ -177,15 +200,21 @@
                 <w:b/>
                 <w:i w:val="0"/>
                 <w:color w:val="14313A"/>
-                <w:sz w:val="15"/>
+                <w:sz w:val="17"/>
               </w:rPr>
-              <w:t>PARTE VENDEDORA</w:t>
+              <w:t>M.T. BAT Sociedad Anónima · representante: Sra. Mabel Torrico</w:t>
             </w:r>
           </w:p>
         </w:tc>
+      </w:tr>
+      <w:tr>
+        <w:trPr>
+          <w:cantSplit/>
+        </w:trPr>
         <w:tc>
           <w:tcPr>
-            <w:tcW w:type="dxa" w:w="7257"/>
+            <w:tcW w:type="dxa" w:w="2835"/>
+            <w:shd w:val="clear" w:color="auto" w:fill="14313A"/>
             <w:vAlign w:val="center"/>
           </w:tcPr>
           <w:p>
@@ -196,24 +225,18 @@
             <w:r>
               <w:rPr>
                 <w:rFonts w:ascii="Poppins" w:hAnsi="Poppins" w:eastAsia="Poppins"/>
-                <w:b w:val="0"/>
+                <w:b/>
                 <w:i w:val="0"/>
-                <w:color w:val="2A2620"/>
-                <w:sz w:val="17"/>
+                <w:color w:val="FFFFFF"/>
+                <w:sz w:val="15"/>
               </w:rPr>
-              <w:t>M.T. BAT Sociedad Anónima — representante: Sra. Mabel Torrico</w:t>
+              <w:t>INMOBILIARIA COLOCADORA</w:t>
             </w:r>
           </w:p>
         </w:tc>
-      </w:tr>
-      <w:tr>
-        <w:trPr>
-          <w:cantSplit/>
-        </w:trPr>
         <w:tc>
           <w:tcPr>
-            <w:tcW w:type="dxa" w:w="2381"/>
-            <w:shd w:val="clear" w:color="auto" w:fill="F3EDE3"/>
+            <w:tcW w:type="dxa" w:w="6803"/>
             <w:vAlign w:val="center"/>
           </w:tcPr>
           <w:p>
@@ -227,15 +250,21 @@
                 <w:b/>
                 <w:i w:val="0"/>
                 <w:color w:val="14313A"/>
-                <w:sz w:val="15"/>
+                <w:sz w:val="17"/>
               </w:rPr>
-              <w:t>INMUEBLE</w:t>
+              <w:t>Meridiano Capital, a través de Juan José Castillo · Broker inmobiliario</w:t>
             </w:r>
           </w:p>
         </w:tc>
+      </w:tr>
+      <w:tr>
+        <w:trPr>
+          <w:cantSplit/>
+        </w:trPr>
         <w:tc>
           <w:tcPr>
-            <w:tcW w:type="dxa" w:w="7257"/>
+            <w:tcW w:type="dxa" w:w="2835"/>
+            <w:shd w:val="clear" w:color="auto" w:fill="14313A"/>
             <w:vAlign w:val="center"/>
           </w:tcPr>
           <w:p>
@@ -246,24 +275,18 @@
             <w:r>
               <w:rPr>
                 <w:rFonts w:ascii="Poppins" w:hAnsi="Poppins" w:eastAsia="Poppins"/>
-                <w:b w:val="0"/>
+                <w:b/>
                 <w:i w:val="0"/>
-                <w:color w:val="2A2620"/>
-                <w:sz w:val="17"/>
+                <w:color w:val="FFFFFF"/>
+                <w:sz w:val="15"/>
               </w:rPr>
-              <w:t>Edificio Inox, edificio mixto de departamentos y locales comerciales — Avda. República Argentina esquina Tobatí, Asunción — Cta. Cte. Catastral N.º 14-0322-17</w:t>
+              <w:t>ASESORA INMOBILIARIA</w:t>
             </w:r>
           </w:p>
         </w:tc>
-      </w:tr>
-      <w:tr>
-        <w:trPr>
-          <w:cantSplit/>
-        </w:trPr>
         <w:tc>
           <w:tcPr>
-            <w:tcW w:type="dxa" w:w="2381"/>
-            <w:shd w:val="clear" w:color="auto" w:fill="F3EDE3"/>
+            <w:tcW w:type="dxa" w:w="6803"/>
             <w:vAlign w:val="center"/>
           </w:tcPr>
           <w:p>
@@ -277,31 +300,9 @@
                 <w:b/>
                 <w:i w:val="0"/>
                 <w:color w:val="14313A"/>
-                <w:sz w:val="15"/>
-              </w:rPr>
-              <w:t>INMOBILIARIA COLOCADORA</w:t>
-            </w:r>
-          </w:p>
-        </w:tc>
-        <w:tc>
-          <w:tcPr>
-            <w:tcW w:type="dxa" w:w="7257"/>
-            <w:vAlign w:val="center"/>
-          </w:tcPr>
-          <w:p>
-            <w:pPr>
-              <w:spacing w:after="0"/>
-              <w:jc w:val="left"/>
-            </w:pPr>
-            <w:r>
-              <w:rPr>
-                <w:rFonts w:ascii="Poppins" w:hAnsi="Poppins" w:eastAsia="Poppins"/>
-                <w:b w:val="0"/>
-                <w:i w:val="0"/>
-                <w:color w:val="2A2620"/>
                 <w:sz w:val="17"/>
               </w:rPr>
-              <w:t>Meridiano Capital, a través de su broker inmobiliario Juan José Castillo</w:t>
+              <w:t>Lourdes Baratto</w:t>
             </w:r>
           </w:p>
         </w:tc>
@@ -310,7 +311,7 @@
     <w:p>
       <w:pPr>
         <w:keepNext w:val="0"/>
-        <w:spacing w:before="140" w:after="0" w:line="254" w:lineRule="auto"/>
+        <w:spacing w:before="160" w:after="0" w:line="250" w:lineRule="auto"/>
         <w:jc w:val="left"/>
       </w:pPr>
       <w:r>
@@ -319,35 +320,32 @@
           <w:b w:val="0"/>
           <w:i w:val="0"/>
           <w:color w:val="2A2620"/>
-          <w:sz w:val="19"/>
+          <w:sz w:val="18"/>
         </w:rPr>
-        <w:t xml:space="preserve">Señor </w:t>
+        <w:t>Señor</w:t>
       </w:r>
+    </w:p>
+    <w:p>
+      <w:pPr>
+        <w:keepNext w:val="0"/>
+        <w:spacing w:before="0" w:after="0" w:line="250" w:lineRule="auto"/>
+        <w:jc w:val="left"/>
+      </w:pPr>
       <w:r>
         <w:rPr>
           <w:rFonts w:ascii="Poppins" w:hAnsi="Poppins" w:eastAsia="Poppins"/>
           <w:b/>
           <w:i w:val="0"/>
           <w:color w:val="14313A"/>
-          <w:sz w:val="19"/>
+          <w:sz w:val="18"/>
         </w:rPr>
         <w:t>Matías Manzato</w:t>
-      </w:r>
-      <w:r>
-        <w:rPr>
-          <w:rFonts w:ascii="Poppins" w:hAnsi="Poppins" w:eastAsia="Poppins"/>
-          <w:b w:val="0"/>
-          <w:i w:val="0"/>
-          <w:color w:val="2A2620"/>
-          <w:sz w:val="19"/>
-        </w:rPr>
-        <w:t xml:space="preserve"> — C.I. N.º 9489984</w:t>
       </w:r>
     </w:p>
     <w:p>
       <w:pPr>
         <w:keepNext w:val="0"/>
-        <w:spacing w:before="0" w:after="0" w:line="254" w:lineRule="auto"/>
+        <w:spacing w:before="0" w:after="120" w:line="250" w:lineRule="auto"/>
         <w:jc w:val="left"/>
       </w:pPr>
       <w:r>
@@ -364,24 +362,25 @@
     <w:p>
       <w:pPr>
         <w:keepNext w:val="0"/>
-        <w:spacing w:before="140" w:after="80" w:line="254" w:lineRule="auto"/>
-        <w:jc w:val="left"/>
+        <w:spacing w:before="0" w:after="120" w:line="250" w:lineRule="auto"/>
+        <w:jc w:val="center"/>
       </w:pPr>
       <w:r>
         <w:rPr>
           <w:rFonts w:ascii="Poppins" w:hAnsi="Poppins" w:eastAsia="Poppins"/>
-          <w:b w:val="0"/>
+          <w:b/>
           <w:i w:val="0"/>
-          <w:color w:val="2A2620"/>
+          <w:color w:val="14313A"/>
           <w:sz w:val="18"/>
         </w:rPr>
-        <w:t>Señor Matías Manzato:</w:t>
+        <w:t>Ref.: Respuesta a su propuesta de compra del 16 de octubre de 2026 – Edificio Inox, Asunción</w:t>
       </w:r>
     </w:p>
     <w:p>
       <w:pPr>
         <w:keepNext w:val="0"/>
-        <w:spacing w:before="0" w:after="100" w:line="254" w:lineRule="auto"/>
+        <w:spacing w:before="0" w:after="100" w:line="250" w:lineRule="auto"/>
+        <w:ind w:firstLine="567"/>
         <w:jc w:val="both"/>
       </w:pPr>
       <w:r>
@@ -392,13 +391,14 @@
           <w:color w:val="2A2620"/>
           <w:sz w:val="18"/>
         </w:rPr>
-        <w:t>En relación con su propuesta formal de compra de fecha 16 de octubre de 2026, por USD 700.000, correspondiente al Edificio Inox, ubicado en Avda. República Argentina esquina Tobatí de Asunción, identificado con Cuenta Corriente Catastral N.º 14-0322-17, propiedad de M.T. BAT Sociedad Anónima, cuya representante identificada es la señora Mabel Torrico, Meridiano Capital, a través de su broker inmobiliario Juan José Castillo, en su carácter de inmobiliaria colocadora, canaliza la respuesta comunicada por la parte vendedora.</w:t>
+        <w:t>Por medio de la presente le transmitimos la respuesta de la parte vendedora a su propuesta formal de compra del 16 de octubre de 2026 por USD 700.000. Meridiano Capital actúa en esta operación como inmobiliaria colocadora a través de su broker inmobiliario Juan José Castillo.</w:t>
       </w:r>
     </w:p>
     <w:p>
       <w:pPr>
         <w:keepNext w:val="0"/>
-        <w:spacing w:before="0" w:after="100" w:line="254" w:lineRule="auto"/>
+        <w:spacing w:before="0" w:after="100" w:line="250" w:lineRule="auto"/>
+        <w:ind w:firstLine="567"/>
         <w:jc w:val="both"/>
       </w:pPr>
       <w:r>
@@ -409,13 +409,14 @@
           <w:color w:val="2A2620"/>
           <w:sz w:val="18"/>
         </w:rPr>
-        <w:t>Su presentación como interesado consta en la carta de presentación de cliente y reconocimiento de comisión por intermediación dirigida a la parte vendedora, en la que se deja constancia de la intermediación de ambos asesores inmobiliarios intervinientes: la señora Lourdes Baratto y Meridiano Capital, a través de su broker inmobiliario Juan José Castillo.</w:t>
+        <w:t>Su propuesta se refiere al Edificio Inox, ubicado en Avda. República Argentina esquina Tobatí de Asunción e identificado con la Cuenta Corriente Catastral N.º 14-0322-17. El inmueble es propiedad de M.T. BAT Sociedad Anónima, representada por la señora Mabel Torrico.</w:t>
       </w:r>
     </w:p>
     <w:p>
       <w:pPr>
         <w:keepNext w:val="0"/>
-        <w:spacing w:before="0" w:after="120" w:line="254" w:lineRule="auto"/>
+        <w:spacing w:before="0" w:after="100" w:line="250" w:lineRule="auto"/>
+        <w:ind w:firstLine="567"/>
         <w:jc w:val="both"/>
       </w:pPr>
       <w:r>
@@ -426,32 +427,43 @@
           <w:color w:val="2A2620"/>
           <w:sz w:val="18"/>
         </w:rPr>
-        <w:t>En consideración de los presupuestos y las necesidades de remodelación planteadas por la parte compradora para la regularización de planos y los arreglos básicos del edificio, la parte vendedora acepta reducir el precio de venta a USD 820.000 (ochocientos veinte mil dólares estadounidenses), conforme a las condiciones que se detallan a continuación. La reducción no implica que la parte vendedora asuma la ejecución ni el costo de dichas reformas o regularizaciones.</w:t>
+        <w:t>Su presentación como interesado consta en la carta de presentación de cliente y reconocimiento de comisión dirigida a la parte vendedora. Esa carta deja constancia de la intermediación de los dos asesores inmobiliarios intervinientes: la señora Lourdes Baratto y Meridiano Capital a través de su broker inmobiliario Juan José Castillo.</w:t>
+      </w:r>
+    </w:p>
+    <w:p>
+      <w:pPr>
+        <w:keepNext w:val="0"/>
+        <w:spacing w:before="0" w:after="40" w:line="250" w:lineRule="auto"/>
+        <w:ind w:firstLine="567"/>
+        <w:jc w:val="both"/>
+      </w:pPr>
+      <w:r>
+        <w:rPr>
+          <w:rFonts w:ascii="Poppins" w:hAnsi="Poppins" w:eastAsia="Poppins"/>
+          <w:b w:val="0"/>
+          <w:i w:val="0"/>
+          <w:color w:val="2A2620"/>
+          <w:sz w:val="18"/>
+        </w:rPr>
+        <w:t>La parte vendedora tuvo en cuenta los presupuestos y las necesidades de remodelación que usted planteó para regularizar los planos y realizar los arreglos básicos del edificio. En consideración de ello, acepta reducir el precio de venta a USD 820.000 (ochocientos veinte mil dólares estadounidenses) en las condiciones que se detallan a continuación. La reducción no implica que la parte vendedora asuma la ejecución ni el costo de esas reformas o regularizaciones.</w:t>
       </w:r>
     </w:p>
     <w:p>
       <w:pPr>
         <w:keepNext/>
-        <w:spacing w:before="0" w:after="80" w:line="254" w:lineRule="auto"/>
-        <w:jc w:val="both"/>
+        <w:spacing w:before="120" w:after="60" w:line="250" w:lineRule="auto"/>
+        <w:jc w:val="left"/>
+        <w:pBdr>
+          <w:bottom w:val="single" w:sz="4" w:color="DAD2C0" w:space="2"/>
+        </w:pBdr>
       </w:pPr>
       <w:r>
         <w:rPr>
-          <w:rFonts w:ascii="Poppins" w:hAnsi="Poppins" w:eastAsia="Poppins"/>
-          <w:b/>
-          <w:i w:val="0"/>
-          <w:color w:val="A87D22"/>
-          <w:sz w:val="19"/>
-        </w:rPr>
-        <w:t xml:space="preserve">1.  </w:t>
-      </w:r>
-      <w:r>
-        <w:rPr>
-          <w:rFonts w:ascii="Poppins" w:hAnsi="Poppins" w:eastAsia="Poppins"/>
-          <w:b/>
+          <w:rFonts w:ascii="Fraunces" w:hAnsi="Fraunces" w:eastAsia="Fraunces"/>
+          <w:b w:val="0"/>
           <w:i w:val="0"/>
           <w:color w:val="14313A"/>
-          <w:sz w:val="19"/>
+          <w:sz w:val="24"/>
         </w:rPr>
         <w:t>Precio y forma de pago</w:t>
       </w:r>
@@ -911,7 +923,7 @@
     <w:p>
       <w:pPr>
         <w:keepNext w:val="0"/>
-        <w:spacing w:before="80" w:after="120" w:line="254" w:lineRule="auto"/>
+        <w:spacing w:before="80" w:after="40" w:line="250" w:lineRule="auto"/>
         <w:jc w:val="both"/>
       </w:pPr>
       <w:r>
@@ -928,16 +940,19 @@
     <w:p>
       <w:pPr>
         <w:keepNext/>
-        <w:spacing w:before="0" w:after="80" w:line="254" w:lineRule="auto"/>
-        <w:jc w:val="both"/>
+        <w:spacing w:before="120" w:after="60" w:line="250" w:lineRule="auto"/>
+        <w:jc w:val="left"/>
+        <w:pBdr>
+          <w:bottom w:val="single" w:sz="4" w:color="DAD2C0" w:space="2"/>
+        </w:pBdr>
       </w:pPr>
       <w:r>
         <w:rPr>
-          <w:rFonts w:ascii="Poppins" w:hAnsi="Poppins" w:eastAsia="Poppins"/>
-          <w:b/>
+          <w:rFonts w:ascii="Fraunces" w:hAnsi="Fraunces" w:eastAsia="Fraunces"/>
+          <w:b w:val="0"/>
           <w:i w:val="0"/>
           <w:color w:val="14313A"/>
-          <w:sz w:val="19"/>
+          <w:sz w:val="24"/>
         </w:rPr>
         <w:t>Condiciones de la operación</w:t>
       </w:r>
@@ -948,7 +963,7 @@
         <w:tabs>
           <w:tab w:pos="425" w:val="left"/>
         </w:tabs>
-        <w:spacing w:before="0" w:after="60" w:line="254" w:lineRule="auto"/>
+        <w:spacing w:before="0" w:after="40" w:line="250" w:lineRule="auto"/>
         <w:ind w:left="425" w:hanging="425"/>
         <w:jc w:val="both"/>
       </w:pPr>
@@ -960,7 +975,7 @@
           <w:color w:val="A87D22"/>
           <w:sz w:val="18"/>
         </w:rPr>
-        <w:t>2.</w:t>
+        <w:t>1.</w:t>
         <w:tab/>
       </w:r>
       <w:r>
@@ -990,7 +1005,7 @@
         <w:tabs>
           <w:tab w:pos="425" w:val="left"/>
         </w:tabs>
-        <w:spacing w:before="0" w:after="60" w:line="254" w:lineRule="auto"/>
+        <w:spacing w:before="0" w:after="40" w:line="250" w:lineRule="auto"/>
         <w:ind w:left="425" w:hanging="425"/>
         <w:jc w:val="both"/>
       </w:pPr>
@@ -1002,7 +1017,7 @@
           <w:color w:val="A87D22"/>
           <w:sz w:val="18"/>
         </w:rPr>
-        <w:t>3.</w:t>
+        <w:t>2.</w:t>
         <w:tab/>
       </w:r>
       <w:r>
@@ -1032,7 +1047,49 @@
         <w:tabs>
           <w:tab w:pos="425" w:val="left"/>
         </w:tabs>
-        <w:spacing w:before="0" w:after="60" w:line="254" w:lineRule="auto"/>
+        <w:spacing w:before="0" w:after="40" w:line="250" w:lineRule="auto"/>
+        <w:ind w:left="425" w:hanging="425"/>
+        <w:jc w:val="both"/>
+      </w:pPr>
+      <w:r>
+        <w:rPr>
+          <w:rFonts w:ascii="Poppins" w:hAnsi="Poppins" w:eastAsia="Poppins"/>
+          <w:b/>
+          <w:i w:val="0"/>
+          <w:color w:val="A87D22"/>
+          <w:sz w:val="18"/>
+        </w:rPr>
+        <w:t>3.</w:t>
+        <w:tab/>
+      </w:r>
+      <w:r>
+        <w:rPr>
+          <w:rFonts w:ascii="Poppins" w:hAnsi="Poppins" w:eastAsia="Poppins"/>
+          <w:b/>
+          <w:i w:val="0"/>
+          <w:color w:val="14313A"/>
+          <w:sz w:val="18"/>
+        </w:rPr>
+        <w:t xml:space="preserve">IVA. </w:t>
+      </w:r>
+      <w:r>
+        <w:rPr>
+          <w:rFonts w:ascii="Poppins" w:hAnsi="Poppins" w:eastAsia="Poppins"/>
+          <w:b w:val="0"/>
+          <w:i w:val="0"/>
+          <w:color w:val="2A2620"/>
+          <w:sz w:val="18"/>
+        </w:rPr>
+        <w:t>El IVA correspondiente a la venta del inmueble será pagado por la parte vendedora a la tasa del 5 % aplicable a la enajenación de inmuebles, como lo establece la ley. No se adiciona al precio de USD 820.000.</w:t>
+      </w:r>
+    </w:p>
+    <w:p>
+      <w:pPr>
+        <w:keepNext w:val="0"/>
+        <w:tabs>
+          <w:tab w:pos="425" w:val="left"/>
+        </w:tabs>
+        <w:spacing w:before="0" w:after="40" w:line="250" w:lineRule="auto"/>
         <w:ind w:left="425" w:hanging="425"/>
         <w:jc w:val="both"/>
       </w:pPr>
@@ -1055,7 +1112,7 @@
           <w:color w:val="14313A"/>
           <w:sz w:val="18"/>
         </w:rPr>
-        <w:t xml:space="preserve">IVA. </w:t>
+        <w:t xml:space="preserve">Impuestos inmobiliarios. </w:t>
       </w:r>
       <w:r>
         <w:rPr>
@@ -1065,7 +1122,7 @@
           <w:color w:val="2A2620"/>
           <w:sz w:val="18"/>
         </w:rPr>
-        <w:t>El IVA correspondiente a la venta del inmueble, a la tasa del 5 % aplicable a la enajenación de inmuebles, será pagado por la parte vendedora, como lo establece la ley. No se adiciona al precio de USD 820.000.</w:t>
+        <w:t>Los impuestos inmobiliarios deben estar al día y son a cargo de la parte vendedora, como lo establece la ley.</w:t>
       </w:r>
     </w:p>
     <w:p>
@@ -1074,7 +1131,7 @@
         <w:tabs>
           <w:tab w:pos="425" w:val="left"/>
         </w:tabs>
-        <w:spacing w:before="0" w:after="60" w:line="254" w:lineRule="auto"/>
+        <w:spacing w:before="0" w:after="40" w:line="250" w:lineRule="auto"/>
         <w:ind w:left="425" w:hanging="425"/>
         <w:jc w:val="both"/>
       </w:pPr>
@@ -1097,7 +1154,7 @@
           <w:color w:val="14313A"/>
           <w:sz w:val="18"/>
         </w:rPr>
-        <w:t xml:space="preserve">Impuestos inmobiliarios. </w:t>
+        <w:t xml:space="preserve">Aprobación bancaria. </w:t>
       </w:r>
       <w:r>
         <w:rPr>
@@ -1107,7 +1164,7 @@
           <w:color w:val="2A2620"/>
           <w:sz w:val="18"/>
         </w:rPr>
-        <w:t>Los impuestos inmobiliarios deben estar al día, a cargo de la parte vendedora, como lo establece la ley.</w:t>
+        <w:t>Toda la operación y las transferencias estarán sujetas a la aprobación del banco interviniente. La parte vendedora se compromete a facilitar y gestionar de común acuerdo toda la información y la documentación que soliciten los bancos intervinientes en las transferencias.</w:t>
       </w:r>
     </w:p>
     <w:p>
@@ -1116,7 +1173,7 @@
         <w:tabs>
           <w:tab w:pos="425" w:val="left"/>
         </w:tabs>
-        <w:spacing w:before="0" w:after="60" w:line="254" w:lineRule="auto"/>
+        <w:spacing w:before="0" w:after="40" w:line="250" w:lineRule="auto"/>
         <w:ind w:left="425" w:hanging="425"/>
         <w:jc w:val="both"/>
       </w:pPr>
@@ -1139,7 +1196,7 @@
           <w:color w:val="14313A"/>
           <w:sz w:val="18"/>
         </w:rPr>
-        <w:t xml:space="preserve">Aprobación bancaria. </w:t>
+        <w:t xml:space="preserve">Acompañamiento de transición. </w:t>
       </w:r>
       <w:r>
         <w:rPr>
@@ -1149,7 +1206,7 @@
           <w:color w:val="2A2620"/>
           <w:sz w:val="18"/>
         </w:rPr>
-        <w:t>Toda la operación y las transferencias estarán sujetas a la aprobación del banco interviniente. La parte vendedora se compromete a facilitar y gestionar, de común acuerdo, toda la información y documentación necesaria que soliciten los bancos intervinientes en las transferencias.</w:t>
+        <w:t>La parte vendedora se compromete a acompañar a la parte compradora durante seis (6) meses desde la compra. Brindará toda la información y el conocimiento necesarios para el traspaso de la documentación y de la gestión de locación del edificio. Este acompañamiento es informativo y de transición: no constituye garantía de renta, administración del edificio ni cobranza, ni responsabilidad por las decisiones futuras de la parte compradora.</w:t>
       </w:r>
     </w:p>
     <w:p>
@@ -1158,7 +1215,7 @@
         <w:tabs>
           <w:tab w:pos="425" w:val="left"/>
         </w:tabs>
-        <w:spacing w:before="0" w:after="60" w:line="254" w:lineRule="auto"/>
+        <w:spacing w:before="0" w:after="40" w:line="250" w:lineRule="auto"/>
         <w:ind w:left="425" w:hanging="425"/>
         <w:jc w:val="both"/>
       </w:pPr>
@@ -1181,7 +1238,7 @@
           <w:color w:val="14313A"/>
           <w:sz w:val="18"/>
         </w:rPr>
-        <w:t xml:space="preserve">Acompañamiento de transición. </w:t>
+        <w:t xml:space="preserve">Verificación documental. </w:t>
       </w:r>
       <w:r>
         <w:rPr>
@@ -1191,7 +1248,7 @@
           <w:color w:val="2A2620"/>
           <w:sz w:val="18"/>
         </w:rPr>
-        <w:t>La parte vendedora se compromete a acompañar a la parte compradora durante seis (6) meses desde la compra, brindando toda la información y el conocimiento necesarios para el traspaso de la documentación y de la gestión de locación del edificio. Este acompañamiento tiene carácter informativo y de transición; no constituye garantía de renta, administración del edificio, cobranza ni responsabilidad por las decisiones futuras de la parte compradora.</w:t>
+        <w:t>Conforme a su propuesta, la operación sigue sujeta a la verificación de la documentación de dominio del inmueble y de que se encuentre libre de gravámenes. La presente no implica que esa verificación ya se haya realizado.</w:t>
       </w:r>
     </w:p>
     <w:p>
@@ -1200,7 +1257,7 @@
         <w:tabs>
           <w:tab w:pos="425" w:val="left"/>
         </w:tabs>
-        <w:spacing w:before="0" w:after="60" w:line="254" w:lineRule="auto"/>
+        <w:spacing w:before="0" w:after="40" w:line="250" w:lineRule="auto"/>
         <w:ind w:left="425" w:hanging="425"/>
         <w:jc w:val="both"/>
       </w:pPr>
@@ -1223,48 +1280,6 @@
           <w:color w:val="14313A"/>
           <w:sz w:val="18"/>
         </w:rPr>
-        <w:t xml:space="preserve">Verificación documental. </w:t>
-      </w:r>
-      <w:r>
-        <w:rPr>
-          <w:rFonts w:ascii="Poppins" w:hAnsi="Poppins" w:eastAsia="Poppins"/>
-          <w:b w:val="0"/>
-          <w:i w:val="0"/>
-          <w:color w:val="2A2620"/>
-          <w:sz w:val="18"/>
-        </w:rPr>
-        <w:t>Conforme a su propuesta, la operación continúa sujeta a la verificación de la documentación de dominio del inmueble y de que este se encuentre libre de gravámenes, sin que la presente implique que dicha verificación ya se haya realizado.</w:t>
-      </w:r>
-    </w:p>
-    <w:p>
-      <w:pPr>
-        <w:keepNext w:val="0"/>
-        <w:tabs>
-          <w:tab w:pos="425" w:val="left"/>
-        </w:tabs>
-        <w:spacing w:before="0" w:after="60" w:line="254" w:lineRule="auto"/>
-        <w:ind w:left="425" w:hanging="425"/>
-        <w:jc w:val="both"/>
-      </w:pPr>
-      <w:r>
-        <w:rPr>
-          <w:rFonts w:ascii="Poppins" w:hAnsi="Poppins" w:eastAsia="Poppins"/>
-          <w:b/>
-          <w:i w:val="0"/>
-          <w:color w:val="A87D22"/>
-          <w:sz w:val="18"/>
-        </w:rPr>
-        <w:t>9.</w:t>
-        <w:tab/>
-      </w:r>
-      <w:r>
-        <w:rPr>
-          <w:rFonts w:ascii="Poppins" w:hAnsi="Poppins" w:eastAsia="Poppins"/>
-          <w:b/>
-          <w:i w:val="0"/>
-          <w:color w:val="14313A"/>
-          <w:sz w:val="18"/>
-        </w:rPr>
         <w:t xml:space="preserve">Formalización. </w:t>
       </w:r>
       <w:r>
@@ -1275,40 +1290,132 @@
           <w:color w:val="2A2620"/>
           <w:sz w:val="18"/>
         </w:rPr>
-        <w:t>Las condiciones aquí comunicadas deberán instrumentarse por escrito y ser suscritas por la parte compradora y por la parte vendedora, esta última por medio de quien acredite facultades suficientes. Meridiano Capital, a través de su broker inmobiliario Juan José Castillo, en su carácter de inmobiliaria colocadora, canaliza esta respuesta sin ejercer representación legal de ninguna de las partes ni obligar a M.T. BAT Sociedad Anónima.</w:t>
+        <w:t>Las condiciones aquí comunicadas deberán instrumentarse por escrito y ser firmadas por la parte compradora y por la parte vendedora. Por la parte vendedora firmará quien acredite facultades suficientes.</w:t>
+      </w:r>
+    </w:p>
+    <w:p>
+      <w:pPr>
+        <w:keepNext/>
+        <w:spacing w:before="120" w:after="60" w:line="250" w:lineRule="auto"/>
+        <w:jc w:val="left"/>
+        <w:pBdr>
+          <w:bottom w:val="single" w:sz="4" w:color="DAD2C0" w:space="2"/>
+        </w:pBdr>
+      </w:pPr>
+      <w:r>
+        <w:rPr>
+          <w:rFonts w:ascii="Fraunces" w:hAnsi="Fraunces" w:eastAsia="Fraunces"/>
+          <w:b w:val="0"/>
+          <w:i w:val="0"/>
+          <w:color w:val="14313A"/>
+          <w:sz w:val="24"/>
+        </w:rPr>
+        <w:t>Vigencia, respuesta y alcance</w:t>
+      </w:r>
+    </w:p>
+    <w:p>
+      <w:pPr>
+        <w:keepNext w:val="0"/>
+        <w:spacing w:before="0" w:after="80" w:line="250" w:lineRule="auto"/>
+        <w:jc w:val="both"/>
+      </w:pPr>
+      <w:r>
+        <w:rPr>
+          <w:rFonts w:ascii="Poppins" w:hAnsi="Poppins" w:eastAsia="Poppins"/>
+          <w:b w:val="0"/>
+          <w:i w:val="0"/>
+          <w:color w:val="2A2620"/>
+          <w:sz w:val="18"/>
+        </w:rPr>
+        <w:t>La presente propuesta tiene una validez de 30 (treinta) días hábiles a partir de su fecha de emisión, el 23 de octubre de 2026. La parte compradora comunicará su respuesta por escrito mediante el formulario adjunto a la presente.</w:t>
+      </w:r>
+    </w:p>
+    <w:p>
+      <w:pPr>
+        <w:keepNext w:val="0"/>
+        <w:spacing w:before="0" w:after="80" w:line="250" w:lineRule="auto"/>
+        <w:jc w:val="both"/>
+      </w:pPr>
+      <w:r>
+        <w:rPr>
+          <w:rFonts w:ascii="Poppins" w:hAnsi="Poppins" w:eastAsia="Poppins"/>
+          <w:b w:val="0"/>
+          <w:i w:val="0"/>
+          <w:color w:val="2A2620"/>
+          <w:sz w:val="18"/>
+        </w:rPr>
+        <w:t>Meridiano Capital interviene como inmobiliaria colocadora a través de su broker inmobiliario Juan José Castillo, con la función de presentar y canalizar esta respuesta. Ninguno de los asesores inmobiliarios intervinientes representa legalmente a las partes ni está facultado para obligar a M.T. BAT Sociedad Anónima, aceptar en nombre de la parte compradora o recibir fondos de la operación.</w:t>
+      </w:r>
+    </w:p>
+    <w:p>
+      <w:pPr>
+        <w:keepNext/>
+        <w:spacing w:before="0" w:after="60" w:line="250" w:lineRule="auto"/>
+        <w:jc w:val="both"/>
+      </w:pPr>
+      <w:r>
+        <w:rPr>
+          <w:rFonts w:ascii="Poppins" w:hAnsi="Poppins" w:eastAsia="Poppins"/>
+          <w:b w:val="0"/>
+          <w:i w:val="0"/>
+          <w:color w:val="2A2620"/>
+          <w:sz w:val="18"/>
+        </w:rPr>
+        <w:t>Sin otro particular y aguardando una respuesta favorable, le saludamos atentamente.</w:t>
+      </w:r>
+    </w:p>
+    <w:p>
+      <w:pPr>
+        <w:keepNext/>
+        <w:spacing w:before="0" w:after="0" w:line="250" w:lineRule="auto"/>
+        <w:jc w:val="left"/>
+      </w:pPr>
+      <w:r>
+        <w:rPr>
+          <w:rFonts w:ascii="Poppins" w:hAnsi="Poppins" w:eastAsia="Poppins"/>
+          <w:b w:val="0"/>
+          <w:i/>
+          <w:color w:val="6B6154"/>
+          <w:sz w:val="16"/>
+        </w:rPr>
+        <w:t>Firmas de los intervinientes. La parte vendedora firma en conformidad con estas condiciones; la parte compradora, en toma de conocimiento.</w:t>
       </w:r>
     </w:p>
     <w:tbl>
       <w:tblPr>
         <w:tblW w:type="dxa" w:w="9639"/>
+        <w:jc w:val="center"/>
         <w:tblLook w:firstColumn="1" w:firstRow="1" w:lastColumn="0" w:lastRow="0" w:noHBand="0" w:noVBand="1" w:val="04A0"/>
-        <w:tblBorders>
-          <w:top w:val="single" w:sz="6" w:color="C9982E"/>
-          <w:left w:val="single" w:sz="6" w:color="C9982E"/>
-          <w:bottom w:val="single" w:sz="6" w:color="C9982E"/>
-          <w:right w:val="single" w:sz="6" w:color="C9982E"/>
-        </w:tblBorders>
         <w:tblLayout w:type="fixed"/>
         <w:tblCellMar>
-          <w:top w:w="45" w:type="dxa"/>
-          <w:bottom w:w="45" w:type="dxa"/>
-          <w:left w:w="140" w:type="dxa"/>
-          <w:right w:w="140" w:type="dxa"/>
+          <w:top w:w="0" w:type="dxa"/>
+          <w:bottom w:w="0" w:type="dxa"/>
+          <w:left w:w="300" w:type="dxa"/>
+          <w:right w:w="300" w:type="dxa"/>
         </w:tblCellMar>
         <w:tblLayout w:type="fixed"/>
       </w:tblPr>
       <w:tblGrid>
-        <w:gridCol w:w="9638"/>
+        <w:gridCol w:w="4819"/>
+        <w:gridCol w:w="4819"/>
       </w:tblGrid>
       <w:tr>
+        <w:trPr>
+          <w:cantSplit/>
+        </w:trPr>
         <w:tc>
           <w:tcPr>
-            <w:tcW w:type="dxa" w:w="9638"/>
-            <w:shd w:val="clear" w:color="auto" w:fill="F7F4EE"/>
+            <w:tcW w:type="dxa" w:w="4819"/>
+            <w:vAlign w:val="top"/>
           </w:tcPr>
           <w:p>
             <w:pPr>
-              <w:spacing w:after="0"/>
+              <w:keepNext/>
+              <w:spacing w:before="400" w:after="0"/>
+              <w:jc w:val="center"/>
+              <w:pBdr>
+                <w:top w:val="single" w:sz="6" w:color="14313A" w:space="4"/>
+              </w:pBdr>
             </w:pPr>
             <w:r>
               <w:rPr>
@@ -1318,17 +1425,260 @@
                 <w:color w:val="14313A"/>
                 <w:sz w:val="19"/>
               </w:rPr>
-              <w:t xml:space="preserve">Vigencia: </w:t>
+              <w:t>MABEL TORRICO</w:t>
             </w:r>
+          </w:p>
+          <w:p>
+            <w:pPr>
+              <w:keepNext/>
+              <w:spacing w:after="0"/>
+              <w:jc w:val="center"/>
+            </w:pPr>
             <w:r>
               <w:rPr>
                 <w:rFonts w:ascii="Poppins" w:hAnsi="Poppins" w:eastAsia="Poppins"/>
                 <w:b w:val="0"/>
                 <w:i w:val="0"/>
                 <w:color w:val="2A2620"/>
+                <w:sz w:val="16"/>
+              </w:rPr>
+              <w:t>En representación de M.T. BAT S.A.</w:t>
+            </w:r>
+          </w:p>
+          <w:p>
+            <w:pPr>
+              <w:keepNext/>
+              <w:spacing w:after="0"/>
+              <w:jc w:val="center"/>
+            </w:pPr>
+            <w:r>
+              <w:rPr>
+                <w:rFonts w:ascii="Poppins" w:hAnsi="Poppins" w:eastAsia="Poppins"/>
+                <w:b w:val="0"/>
+                <w:i w:val="0"/>
+                <w:color w:val="2A2620"/>
+                <w:sz w:val="16"/>
+              </w:rPr>
+              <w:t>C.I. N.º ______________</w:t>
+            </w:r>
+          </w:p>
+          <w:p>
+            <w:pPr>
+              <w:keepNext/>
+              <w:spacing w:after="0"/>
+              <w:jc w:val="center"/>
+            </w:pPr>
+            <w:r>
+              <w:rPr>
+                <w:rFonts w:ascii="Poppins" w:hAnsi="Poppins" w:eastAsia="Poppins"/>
+                <w:b/>
+                <w:i w:val="0"/>
+                <w:color w:val="A87D22"/>
+                <w:sz w:val="16"/>
+              </w:rPr>
+              <w:t>PARTE VENDEDORA</w:t>
+            </w:r>
+          </w:p>
+        </w:tc>
+        <w:tc>
+          <w:tcPr>
+            <w:tcW w:type="dxa" w:w="4819"/>
+            <w:vAlign w:val="top"/>
+          </w:tcPr>
+          <w:p>
+            <w:pPr>
+              <w:keepNext/>
+              <w:spacing w:before="400" w:after="0"/>
+              <w:jc w:val="center"/>
+              <w:pBdr>
+                <w:top w:val="single" w:sz="6" w:color="14313A" w:space="4"/>
+              </w:pBdr>
+            </w:pPr>
+            <w:r>
+              <w:rPr>
+                <w:rFonts w:ascii="Poppins" w:hAnsi="Poppins" w:eastAsia="Poppins"/>
+                <w:b/>
+                <w:i w:val="0"/>
+                <w:color w:val="14313A"/>
                 <w:sz w:val="19"/>
               </w:rPr>
-              <w:t>la presente propuesta tiene una validez de 30 días hábiles a partir de su fecha de emisión (23 de octubre de 2026).</w:t>
+              <w:t>MATÍAS MANZATO</w:t>
+            </w:r>
+          </w:p>
+          <w:p>
+            <w:pPr>
+              <w:keepNext/>
+              <w:spacing w:after="0"/>
+              <w:jc w:val="center"/>
+            </w:pPr>
+            <w:r>
+              <w:rPr>
+                <w:rFonts w:ascii="Poppins" w:hAnsi="Poppins" w:eastAsia="Poppins"/>
+                <w:b w:val="0"/>
+                <w:i w:val="0"/>
+                <w:color w:val="2A2620"/>
+                <w:sz w:val="16"/>
+              </w:rPr>
+              <w:t>C.I. N.º 9489984</w:t>
+            </w:r>
+          </w:p>
+          <w:p>
+            <w:pPr>
+              <w:keepNext/>
+              <w:spacing w:after="0"/>
+              <w:jc w:val="center"/>
+            </w:pPr>
+            <w:r>
+              <w:rPr>
+                <w:rFonts w:ascii="Poppins" w:hAnsi="Poppins" w:eastAsia="Poppins"/>
+                <w:b/>
+                <w:i w:val="0"/>
+                <w:color w:val="A87D22"/>
+                <w:sz w:val="16"/>
+              </w:rPr>
+              <w:t>COMPRADOR / OFERENTE</w:t>
+            </w:r>
+          </w:p>
+        </w:tc>
+      </w:tr>
+      <w:tr>
+        <w:trPr>
+          <w:cantSplit/>
+        </w:trPr>
+        <w:tc>
+          <w:tcPr>
+            <w:tcW w:type="dxa" w:w="4819"/>
+            <w:vAlign w:val="top"/>
+          </w:tcPr>
+          <w:p>
+            <w:pPr>
+              <w:keepNext/>
+              <w:spacing w:before="400" w:after="0"/>
+              <w:jc w:val="center"/>
+              <w:pBdr>
+                <w:top w:val="single" w:sz="6" w:color="14313A" w:space="4"/>
+              </w:pBdr>
+            </w:pPr>
+            <w:r>
+              <w:rPr>
+                <w:rFonts w:ascii="Poppins" w:hAnsi="Poppins" w:eastAsia="Poppins"/>
+                <w:b/>
+                <w:i w:val="0"/>
+                <w:color w:val="14313A"/>
+                <w:sz w:val="19"/>
+              </w:rPr>
+              <w:t>JUAN JOSÉ CASTILLO</w:t>
+            </w:r>
+          </w:p>
+          <w:p>
+            <w:pPr>
+              <w:keepNext/>
+              <w:spacing w:after="0"/>
+              <w:jc w:val="center"/>
+            </w:pPr>
+            <w:r>
+              <w:rPr>
+                <w:rFonts w:ascii="Poppins" w:hAnsi="Poppins" w:eastAsia="Poppins"/>
+                <w:b/>
+                <w:i w:val="0"/>
+                <w:color w:val="2A2620"/>
+                <w:sz w:val="16"/>
+              </w:rPr>
+              <w:t>Broker Inmobiliario</w:t>
+            </w:r>
+          </w:p>
+          <w:p>
+            <w:pPr>
+              <w:keepNext/>
+              <w:spacing w:after="0"/>
+              <w:jc w:val="center"/>
+            </w:pPr>
+            <w:r>
+              <w:rPr>
+                <w:rFonts w:ascii="Poppins" w:hAnsi="Poppins" w:eastAsia="Poppins"/>
+                <w:b/>
+                <w:i w:val="0"/>
+                <w:color w:val="14313A"/>
+                <w:sz w:val="16"/>
+              </w:rPr>
+              <w:t>MERIDIANO CAPITAL</w:t>
+            </w:r>
+          </w:p>
+          <w:p>
+            <w:pPr>
+              <w:keepNext w:val="0"/>
+              <w:spacing w:after="0"/>
+              <w:jc w:val="center"/>
+            </w:pPr>
+            <w:r>
+              <w:rPr>
+                <w:rFonts w:ascii="Poppins" w:hAnsi="Poppins" w:eastAsia="Poppins"/>
+                <w:b/>
+                <w:i w:val="0"/>
+                <w:color w:val="A87D22"/>
+                <w:sz w:val="16"/>
+              </w:rPr>
+              <w:t>Inmobiliaria colocadora</w:t>
+            </w:r>
+          </w:p>
+        </w:tc>
+        <w:tc>
+          <w:tcPr>
+            <w:tcW w:type="dxa" w:w="4819"/>
+            <w:vAlign w:val="top"/>
+          </w:tcPr>
+          <w:p>
+            <w:pPr>
+              <w:keepNext/>
+              <w:spacing w:before="400" w:after="0"/>
+              <w:jc w:val="center"/>
+              <w:pBdr>
+                <w:top w:val="single" w:sz="6" w:color="14313A" w:space="4"/>
+              </w:pBdr>
+            </w:pPr>
+            <w:r>
+              <w:rPr>
+                <w:rFonts w:ascii="Poppins" w:hAnsi="Poppins" w:eastAsia="Poppins"/>
+                <w:b/>
+                <w:i w:val="0"/>
+                <w:color w:val="14313A"/>
+                <w:sz w:val="19"/>
+              </w:rPr>
+              <w:t>LOURDES BARATTO</w:t>
+            </w:r>
+          </w:p>
+          <w:p>
+            <w:pPr>
+              <w:keepNext/>
+              <w:spacing w:after="0"/>
+              <w:jc w:val="center"/>
+            </w:pPr>
+            <w:r>
+              <w:rPr>
+                <w:rFonts w:ascii="Poppins" w:hAnsi="Poppins" w:eastAsia="Poppins"/>
+                <w:b w:val="0"/>
+                <w:i w:val="0"/>
+                <w:color w:val="2A2620"/>
+                <w:sz w:val="16"/>
+              </w:rPr>
+              <w:t>C.I. N.º 4480441</w:t>
+            </w:r>
+          </w:p>
+          <w:p>
+            <w:pPr>
+              <w:keepNext w:val="0"/>
+              <w:spacing w:after="0"/>
+              <w:jc w:val="center"/>
+            </w:pPr>
+            <w:r>
+              <w:rPr>
+                <w:rFonts w:ascii="Poppins" w:hAnsi="Poppins" w:eastAsia="Poppins"/>
+                <w:b/>
+                <w:i w:val="0"/>
+                <w:color w:val="A87D22"/>
+                <w:sz w:val="16"/>
+              </w:rPr>
+              <w:t>ASESORA INMOBILIARIA</w:t>
             </w:r>
           </w:p>
         </w:tc>
@@ -1337,7 +1687,242 @@
     <w:p>
       <w:pPr>
         <w:keepNext/>
-        <w:spacing w:before="140" w:after="400" w:line="254" w:lineRule="auto"/>
+        <w:spacing w:before="0" w:after="60" w:line="250" w:lineRule="auto"/>
+        <w:jc w:val="left"/>
+        <w:pageBreakBefore/>
+        <w:pBdr>
+          <w:bottom w:val="single" w:sz="4" w:color="DAD2C0" w:space="2"/>
+        </w:pBdr>
+      </w:pPr>
+      <w:r>
+        <w:rPr>
+          <w:rFonts w:ascii="Fraunces" w:hAnsi="Fraunces" w:eastAsia="Fraunces"/>
+          <w:b w:val="0"/>
+          <w:i w:val="0"/>
+          <w:color w:val="14313A"/>
+          <w:sz w:val="24"/>
+        </w:rPr>
+        <w:t>Constancia de recepción</w:t>
+      </w:r>
+    </w:p>
+    <w:p>
+      <w:pPr>
+        <w:keepNext w:val="0"/>
+        <w:spacing w:before="0" w:after="100" w:line="250" w:lineRule="auto"/>
+        <w:jc w:val="both"/>
+      </w:pPr>
+      <w:r>
+        <w:rPr>
+          <w:rFonts w:ascii="Poppins" w:hAnsi="Poppins" w:eastAsia="Poppins"/>
+          <w:b w:val="0"/>
+          <w:i w:val="0"/>
+          <w:color w:val="2A2620"/>
+          <w:sz w:val="18"/>
+        </w:rPr>
+        <w:t>Recibí copia de esta respuesta y contraoferta. Esta constancia acredita únicamente la recepción y no implica aceptación.</w:t>
+      </w:r>
+    </w:p>
+    <w:tbl>
+      <w:tblPr>
+        <w:tblW w:type="dxa" w:w="9639"/>
+        <w:tblLook w:firstColumn="1" w:firstRow="1" w:lastColumn="0" w:lastRow="0" w:noHBand="0" w:noVBand="1" w:val="04A0"/>
+        <w:jc w:val="center"/>
+        <w:tblBorders>
+          <w:top w:val="single" w:sz="4" w:color="DAD2C0"/>
+          <w:left w:val="single" w:sz="4" w:color="DAD2C0"/>
+          <w:bottom w:val="single" w:sz="4" w:color="DAD2C0"/>
+          <w:right w:val="single" w:sz="4" w:color="DAD2C0"/>
+          <w:insideH w:val="single" w:sz="4" w:color="DAD2C0"/>
+          <w:insideV w:val="single" w:sz="4" w:color="DAD2C0"/>
+        </w:tblBorders>
+        <w:tblLayout w:type="fixed"/>
+        <w:tblCellMar>
+          <w:top w:w="30" w:type="dxa"/>
+          <w:bottom w:w="30" w:type="dxa"/>
+          <w:left w:w="110" w:type="dxa"/>
+          <w:right w:w="110" w:type="dxa"/>
+        </w:tblCellMar>
+        <w:tblLayout w:type="fixed"/>
+      </w:tblPr>
+      <w:tblGrid>
+        <w:gridCol w:w="2835"/>
+        <w:gridCol w:w="6803"/>
+      </w:tblGrid>
+      <w:tr>
+        <w:trPr>
+          <w:cantSplit/>
+        </w:trPr>
+        <w:tc>
+          <w:tcPr>
+            <w:tcW w:type="dxa" w:w="2835"/>
+            <w:shd w:val="clear" w:color="auto" w:fill="F3EDE3"/>
+            <w:vAlign w:val="center"/>
+          </w:tcPr>
+          <w:p>
+            <w:pPr>
+              <w:spacing w:after="0"/>
+              <w:jc w:val="left"/>
+            </w:pPr>
+            <w:r>
+              <w:rPr>
+                <w:rFonts w:ascii="Poppins" w:hAnsi="Poppins" w:eastAsia="Poppins"/>
+                <w:b/>
+                <w:i w:val="0"/>
+                <w:color w:val="14313A"/>
+                <w:sz w:val="15"/>
+              </w:rPr>
+              <w:t>FECHA Y HORA DE RECEPCIÓN</w:t>
+            </w:r>
+          </w:p>
+        </w:tc>
+        <w:tc>
+          <w:tcPr>
+            <w:tcW w:type="dxa" w:w="6803"/>
+            <w:vAlign w:val="center"/>
+          </w:tcPr>
+          <w:p>
+            <w:pPr>
+              <w:spacing w:after="0"/>
+              <w:jc w:val="left"/>
+            </w:pPr>
+            <w:r>
+              <w:rPr>
+                <w:rFonts w:ascii="Poppins" w:hAnsi="Poppins" w:eastAsia="Poppins"/>
+                <w:b w:val="0"/>
+                <w:i w:val="0"/>
+                <w:color w:val="2A2620"/>
+                <w:sz w:val="17"/>
+              </w:rPr>
+              <w:t>____ / ____ / ________ · ____ : ____ hs (hora de Asunción)</w:t>
+            </w:r>
+          </w:p>
+        </w:tc>
+      </w:tr>
+      <w:tr>
+        <w:trPr>
+          <w:cantSplit/>
+          <w:trHeight w:val="737"/>
+        </w:trPr>
+        <w:tc>
+          <w:tcPr>
+            <w:tcW w:type="dxa" w:w="2835"/>
+            <w:shd w:val="clear" w:color="auto" w:fill="F3EDE3"/>
+            <w:vAlign w:val="center"/>
+          </w:tcPr>
+          <w:p>
+            <w:pPr>
+              <w:spacing w:after="0"/>
+              <w:jc w:val="left"/>
+            </w:pPr>
+            <w:r>
+              <w:rPr>
+                <w:rFonts w:ascii="Poppins" w:hAnsi="Poppins" w:eastAsia="Poppins"/>
+                <w:b/>
+                <w:i w:val="0"/>
+                <w:color w:val="14313A"/>
+                <w:sz w:val="15"/>
+              </w:rPr>
+              <w:t>FIRMA</w:t>
+            </w:r>
+          </w:p>
+        </w:tc>
+        <w:tc>
+          <w:tcPr>
+            <w:tcW w:type="dxa" w:w="6803"/>
+            <w:vAlign w:val="center"/>
+          </w:tcPr>
+          <w:p>
+            <w:pPr>
+              <w:spacing w:after="0"/>
+              <w:jc w:val="left"/>
+            </w:pPr>
+            <w:r>
+              <w:rPr>
+                <w:rFonts w:ascii="Poppins" w:hAnsi="Poppins" w:eastAsia="Poppins"/>
+                <w:b w:val="0"/>
+                <w:i w:val="0"/>
+                <w:color w:val="2A2620"/>
+                <w:sz w:val="17"/>
+              </w:rPr>
+            </w:r>
+          </w:p>
+        </w:tc>
+      </w:tr>
+      <w:tr>
+        <w:trPr>
+          <w:cantSplit/>
+        </w:trPr>
+        <w:tc>
+          <w:tcPr>
+            <w:tcW w:type="dxa" w:w="2835"/>
+            <w:shd w:val="clear" w:color="auto" w:fill="F3EDE3"/>
+            <w:vAlign w:val="center"/>
+          </w:tcPr>
+          <w:p>
+            <w:pPr>
+              <w:spacing w:after="0"/>
+              <w:jc w:val="left"/>
+            </w:pPr>
+            <w:r>
+              <w:rPr>
+                <w:rFonts w:ascii="Poppins" w:hAnsi="Poppins" w:eastAsia="Poppins"/>
+                <w:b/>
+                <w:i w:val="0"/>
+                <w:color w:val="14313A"/>
+                <w:sz w:val="15"/>
+              </w:rPr>
+              <w:t>ACLARACIÓN Y DOCUMENTO</w:t>
+            </w:r>
+          </w:p>
+        </w:tc>
+        <w:tc>
+          <w:tcPr>
+            <w:tcW w:type="dxa" w:w="6803"/>
+            <w:vAlign w:val="center"/>
+          </w:tcPr>
+          <w:p>
+            <w:pPr>
+              <w:spacing w:after="0"/>
+              <w:jc w:val="left"/>
+            </w:pPr>
+            <w:r>
+              <w:rPr>
+                <w:rFonts w:ascii="Poppins" w:hAnsi="Poppins" w:eastAsia="Poppins"/>
+                <w:b w:val="0"/>
+                <w:i w:val="0"/>
+                <w:color w:val="2A2620"/>
+                <w:sz w:val="17"/>
+              </w:rPr>
+              <w:t>Matías Manzato · C.I. N.º 9489984</w:t>
+            </w:r>
+          </w:p>
+        </w:tc>
+      </w:tr>
+    </w:tbl>
+    <w:p>
+      <w:pPr>
+        <w:keepNext/>
+        <w:spacing w:before="280" w:after="60" w:line="250" w:lineRule="auto"/>
+        <w:jc w:val="left"/>
+        <w:pBdr>
+          <w:bottom w:val="single" w:sz="4" w:color="DAD2C0" w:space="2"/>
+        </w:pBdr>
+      </w:pPr>
+      <w:r>
+        <w:rPr>
+          <w:rFonts w:ascii="Fraunces" w:hAnsi="Fraunces" w:eastAsia="Fraunces"/>
+          <w:b w:val="0"/>
+          <w:i w:val="0"/>
+          <w:color w:val="14313A"/>
+          <w:sz w:val="24"/>
+        </w:rPr>
+        <w:t>Respuesta de la parte compradora</w:t>
+      </w:r>
+    </w:p>
+    <w:p>
+      <w:pPr>
+        <w:keepNext w:val="0"/>
+        <w:spacing w:before="0" w:after="60" w:line="250" w:lineRule="auto"/>
         <w:jc w:val="left"/>
       </w:pPr>
       <w:r>
@@ -1348,84 +1933,312 @@
           <w:color w:val="2A2620"/>
           <w:sz w:val="18"/>
         </w:rPr>
-        <w:t>Quedamos a su disposición para recibir su conformidad y coordinar con ambas partes los pasos de instrumentación de la operación, junto con los profesionales que intervengan en su formalización. Esperando una respuesta favorable, le saludamos muy atentamente.</w:t>
+        <w:t>Marcar una sola opción:</w:t>
       </w:r>
     </w:p>
     <w:p>
       <w:pPr>
-        <w:keepNext/>
-        <w:spacing w:before="0" w:after="0" w:line="254" w:lineRule="auto"/>
-        <w:ind w:left="5556"/>
-        <w:jc w:val="left"/>
-        <w:pBdr>
-          <w:top w:val="single" w:sz="6" w:color="14313A" w:space="4"/>
-        </w:pBdr>
-      </w:pPr>
-      <w:r>
-        <w:rPr>
-          <w:rFonts w:ascii="Poppins" w:hAnsi="Poppins" w:eastAsia="Poppins"/>
-          <w:b/>
-          <w:i w:val="0"/>
-          <w:color w:val="14313A"/>
-          <w:sz w:val="21"/>
-        </w:rPr>
-        <w:t>JUAN JOSÉ CASTILLO</w:t>
-      </w:r>
-    </w:p>
-    <w:p>
-      <w:pPr>
-        <w:keepNext/>
-        <w:spacing w:before="0" w:after="0" w:line="254" w:lineRule="auto"/>
-        <w:ind w:left="5556"/>
+        <w:keepNext w:val="0"/>
+        <w:spacing w:before="0" w:after="60" w:line="250" w:lineRule="auto"/>
         <w:jc w:val="left"/>
       </w:pPr>
       <w:r>
         <w:rPr>
           <w:rFonts w:ascii="Poppins" w:hAnsi="Poppins" w:eastAsia="Poppins"/>
-          <w:b/>
+          <w:b w:val="0"/>
+          <w:i w:val="0"/>
+          <w:color w:val="14313A"/>
+          <w:sz w:val="20"/>
+        </w:rPr>
+        <w:t xml:space="preserve">☐  </w:t>
+      </w:r>
+      <w:r>
+        <w:rPr>
+          <w:rFonts w:ascii="Poppins" w:hAnsi="Poppins" w:eastAsia="Poppins"/>
+          <w:b w:val="0"/>
           <w:i w:val="0"/>
           <w:color w:val="2A2620"/>
           <w:sz w:val="18"/>
         </w:rPr>
-        <w:t>Broker Inmobiliario</w:t>
+        <w:t>Acepto íntegramente la contraoferta en los términos de esta carta.</w:t>
       </w:r>
     </w:p>
     <w:p>
       <w:pPr>
-        <w:keepNext/>
-        <w:spacing w:before="0" w:after="0" w:line="254" w:lineRule="auto"/>
-        <w:ind w:left="5556"/>
+        <w:keepNext w:val="0"/>
+        <w:spacing w:before="0" w:after="60" w:line="250" w:lineRule="auto"/>
         <w:jc w:val="left"/>
       </w:pPr>
       <w:r>
         <w:rPr>
           <w:rFonts w:ascii="Poppins" w:hAnsi="Poppins" w:eastAsia="Poppins"/>
-          <w:b/>
+          <w:b w:val="0"/>
           <w:i w:val="0"/>
           <w:color w:val="14313A"/>
+          <w:sz w:val="20"/>
+        </w:rPr>
+        <w:t xml:space="preserve">☐  </w:t>
+      </w:r>
+      <w:r>
+        <w:rPr>
+          <w:rFonts w:ascii="Poppins" w:hAnsi="Poppins" w:eastAsia="Poppins"/>
+          <w:b w:val="0"/>
+          <w:i w:val="0"/>
+          <w:color w:val="2A2620"/>
           <w:sz w:val="18"/>
         </w:rPr>
-        <w:t>MERIDIANO CAPITAL</w:t>
+        <w:t>Rechazo la contraoferta.</w:t>
       </w:r>
     </w:p>
     <w:p>
       <w:pPr>
         <w:keepNext w:val="0"/>
-        <w:spacing w:before="0" w:after="0" w:line="254" w:lineRule="auto"/>
-        <w:ind w:left="5556"/>
+        <w:spacing w:before="0" w:after="60" w:line="250" w:lineRule="auto"/>
         <w:jc w:val="left"/>
       </w:pPr>
       <w:r>
         <w:rPr>
           <w:rFonts w:ascii="Poppins" w:hAnsi="Poppins" w:eastAsia="Poppins"/>
-          <w:b/>
+          <w:b w:val="0"/>
           <w:i w:val="0"/>
-          <w:color w:val="A87D22"/>
+          <w:color w:val="14313A"/>
+          <w:sz w:val="20"/>
+        </w:rPr>
+        <w:t xml:space="preserve">☐  </w:t>
+      </w:r>
+      <w:r>
+        <w:rPr>
+          <w:rFonts w:ascii="Poppins" w:hAnsi="Poppins" w:eastAsia="Poppins"/>
+          <w:b w:val="0"/>
+          <w:i w:val="0"/>
+          <w:color w:val="2A2620"/>
           <w:sz w:val="18"/>
         </w:rPr>
-        <w:t>Inmobiliaria colocadora</w:t>
+        <w:t>Formulo la siguiente contrapropuesta (no implica aceptación de los términos de esta carta):</w:t>
       </w:r>
     </w:p>
+    <w:tbl>
+      <w:tblPr>
+        <w:tblW w:type="dxa" w:w="9639"/>
+        <w:tblLayout w:type="fixed"/>
+        <w:tblLook w:firstColumn="1" w:firstRow="1" w:lastColumn="0" w:lastRow="0" w:noHBand="0" w:noVBand="1" w:val="04A0"/>
+        <w:tblBorders>
+          <w:top w:val="single" w:sz="4" w:color="DAD2C0"/>
+          <w:left w:val="single" w:sz="4" w:color="DAD2C0"/>
+          <w:bottom w:val="single" w:sz="4" w:color="DAD2C0"/>
+          <w:right w:val="single" w:sz="4" w:color="DAD2C0"/>
+        </w:tblBorders>
+        <w:tblLayout w:type="fixed"/>
+      </w:tblPr>
+      <w:tblGrid>
+        <w:gridCol w:w="9638"/>
+      </w:tblGrid>
+      <w:tr>
+        <w:trPr>
+          <w:trHeight w:val="1814"/>
+        </w:trPr>
+        <w:tc>
+          <w:tcPr>
+            <w:tcW w:type="dxa" w:w="9638"/>
+          </w:tcPr>
+          <w:p/>
+        </w:tc>
+      </w:tr>
+    </w:tbl>
+    <w:p>
+      <w:pPr>
+        <w:keepNext w:val="0"/>
+        <w:spacing w:before="160" w:after="100" w:line="250" w:lineRule="auto"/>
+        <w:jc w:val="both"/>
+      </w:pPr>
+      <w:r>
+        <w:rPr>
+          <w:rFonts w:ascii="Poppins" w:hAnsi="Poppins" w:eastAsia="Poppins"/>
+          <w:b w:val="0"/>
+          <w:i w:val="0"/>
+          <w:color w:val="2A2620"/>
+          <w:sz w:val="18"/>
+        </w:rPr>
+        <w:t>En caso de aceptación, las partes instrumentarán la operación por escrito conforme a las condiciones detalladas en esta carta, con la intervención de los asesores inmobiliarios y de la escribanía que corresponda.</w:t>
+      </w:r>
+    </w:p>
+    <w:tbl>
+      <w:tblPr>
+        <w:tblW w:type="dxa" w:w="9639"/>
+        <w:tblLook w:firstColumn="1" w:firstRow="1" w:lastColumn="0" w:lastRow="0" w:noHBand="0" w:noVBand="1" w:val="04A0"/>
+        <w:jc w:val="center"/>
+        <w:tblBorders>
+          <w:top w:val="single" w:sz="4" w:color="DAD2C0"/>
+          <w:left w:val="single" w:sz="4" w:color="DAD2C0"/>
+          <w:bottom w:val="single" w:sz="4" w:color="DAD2C0"/>
+          <w:right w:val="single" w:sz="4" w:color="DAD2C0"/>
+          <w:insideH w:val="single" w:sz="4" w:color="DAD2C0"/>
+          <w:insideV w:val="single" w:sz="4" w:color="DAD2C0"/>
+        </w:tblBorders>
+        <w:tblLayout w:type="fixed"/>
+        <w:tblCellMar>
+          <w:top w:w="30" w:type="dxa"/>
+          <w:bottom w:w="30" w:type="dxa"/>
+          <w:left w:w="110" w:type="dxa"/>
+          <w:right w:w="110" w:type="dxa"/>
+        </w:tblCellMar>
+        <w:tblLayout w:type="fixed"/>
+      </w:tblPr>
+      <w:tblGrid>
+        <w:gridCol w:w="2835"/>
+        <w:gridCol w:w="6803"/>
+      </w:tblGrid>
+      <w:tr>
+        <w:trPr>
+          <w:cantSplit/>
+          <w:trHeight w:val="737"/>
+        </w:trPr>
+        <w:tc>
+          <w:tcPr>
+            <w:tcW w:type="dxa" w:w="2835"/>
+            <w:shd w:val="clear" w:color="auto" w:fill="F3EDE3"/>
+            <w:vAlign w:val="center"/>
+          </w:tcPr>
+          <w:p>
+            <w:pPr>
+              <w:spacing w:after="0"/>
+              <w:jc w:val="left"/>
+            </w:pPr>
+            <w:r>
+              <w:rPr>
+                <w:rFonts w:ascii="Poppins" w:hAnsi="Poppins" w:eastAsia="Poppins"/>
+                <w:b/>
+                <w:i w:val="0"/>
+                <w:color w:val="14313A"/>
+                <w:sz w:val="15"/>
+              </w:rPr>
+              <w:t>FIRMA</w:t>
+            </w:r>
+          </w:p>
+        </w:tc>
+        <w:tc>
+          <w:tcPr>
+            <w:tcW w:type="dxa" w:w="6803"/>
+            <w:vAlign w:val="center"/>
+          </w:tcPr>
+          <w:p>
+            <w:pPr>
+              <w:spacing w:after="0"/>
+              <w:jc w:val="left"/>
+            </w:pPr>
+            <w:r>
+              <w:rPr>
+                <w:rFonts w:ascii="Poppins" w:hAnsi="Poppins" w:eastAsia="Poppins"/>
+                <w:b w:val="0"/>
+                <w:i w:val="0"/>
+                <w:color w:val="2A2620"/>
+                <w:sz w:val="17"/>
+              </w:rPr>
+            </w:r>
+          </w:p>
+        </w:tc>
+      </w:tr>
+      <w:tr>
+        <w:trPr>
+          <w:cantSplit/>
+        </w:trPr>
+        <w:tc>
+          <w:tcPr>
+            <w:tcW w:type="dxa" w:w="2835"/>
+            <w:shd w:val="clear" w:color="auto" w:fill="F3EDE3"/>
+            <w:vAlign w:val="center"/>
+          </w:tcPr>
+          <w:p>
+            <w:pPr>
+              <w:spacing w:after="0"/>
+              <w:jc w:val="left"/>
+            </w:pPr>
+            <w:r>
+              <w:rPr>
+                <w:rFonts w:ascii="Poppins" w:hAnsi="Poppins" w:eastAsia="Poppins"/>
+                <w:b/>
+                <w:i w:val="0"/>
+                <w:color w:val="14313A"/>
+                <w:sz w:val="15"/>
+              </w:rPr>
+              <w:t>ACLARACIÓN Y C.I. N.º</w:t>
+            </w:r>
+          </w:p>
+        </w:tc>
+        <w:tc>
+          <w:tcPr>
+            <w:tcW w:type="dxa" w:w="6803"/>
+            <w:vAlign w:val="center"/>
+          </w:tcPr>
+          <w:p>
+            <w:pPr>
+              <w:spacing w:after="0"/>
+              <w:jc w:val="left"/>
+            </w:pPr>
+            <w:r>
+              <w:rPr>
+                <w:rFonts w:ascii="Poppins" w:hAnsi="Poppins" w:eastAsia="Poppins"/>
+                <w:b w:val="0"/>
+                <w:i w:val="0"/>
+                <w:color w:val="2A2620"/>
+                <w:sz w:val="17"/>
+              </w:rPr>
+              <w:t>Matías Manzato · C.I. N.º 9489984</w:t>
+            </w:r>
+          </w:p>
+        </w:tc>
+      </w:tr>
+      <w:tr>
+        <w:trPr>
+          <w:cantSplit/>
+        </w:trPr>
+        <w:tc>
+          <w:tcPr>
+            <w:tcW w:type="dxa" w:w="2835"/>
+            <w:shd w:val="clear" w:color="auto" w:fill="F3EDE3"/>
+            <w:vAlign w:val="center"/>
+          </w:tcPr>
+          <w:p>
+            <w:pPr>
+              <w:spacing w:after="0"/>
+              <w:jc w:val="left"/>
+            </w:pPr>
+            <w:r>
+              <w:rPr>
+                <w:rFonts w:ascii="Poppins" w:hAnsi="Poppins" w:eastAsia="Poppins"/>
+                <w:b/>
+                <w:i w:val="0"/>
+                <w:color w:val="14313A"/>
+                <w:sz w:val="15"/>
+              </w:rPr>
+              <w:t>FECHA Y HORA</w:t>
+            </w:r>
+          </w:p>
+        </w:tc>
+        <w:tc>
+          <w:tcPr>
+            <w:tcW w:type="dxa" w:w="6803"/>
+            <w:vAlign w:val="center"/>
+          </w:tcPr>
+          <w:p>
+            <w:pPr>
+              <w:spacing w:after="0"/>
+              <w:jc w:val="left"/>
+            </w:pPr>
+            <w:r>
+              <w:rPr>
+                <w:rFonts w:ascii="Poppins" w:hAnsi="Poppins" w:eastAsia="Poppins"/>
+                <w:b w:val="0"/>
+                <w:i w:val="0"/>
+                <w:color w:val="2A2620"/>
+                <w:sz w:val="17"/>
+              </w:rPr>
+              <w:t>____ / ____ / ________ · ____ : ____ hs (hora de Asunción)</w:t>
+            </w:r>
+          </w:p>
+        </w:tc>
+      </w:tr>
+    </w:tbl>
     <w:sectPr>
       <w:headerReference w:type="default" r:id="rId9"/>
       <w:footerReference w:type="default" r:id="rId10"/>
@@ -1514,88 +2327,46 @@
     <w:pPr>
       <w:pStyle w:val="Header"/>
     </w:pPr>
+    <w:r>
+      <w:drawing>
+        <wp:inline xmlns:a="http://schemas.openxmlformats.org/drawingml/2006/main" xmlns:pic="http://schemas.openxmlformats.org/drawingml/2006/picture">
+          <wp:extent cx="1342832" cy="360000"/>
+          <wp:docPr id="1" name="Picture 1"/>
+          <wp:cNvGraphicFramePr>
+            <a:graphicFrameLocks noChangeAspect="1"/>
+          </wp:cNvGraphicFramePr>
+          <a:graphic>
+            <a:graphicData uri="http://schemas.openxmlformats.org/drawingml/2006/picture">
+              <pic:pic>
+                <pic:nvPicPr>
+                  <pic:cNvPr id="0" name="image.png"/>
+                  <pic:cNvPicPr/>
+                </pic:nvPicPr>
+                <pic:blipFill>
+                  <a:blip r:embed="rId1"/>
+                  <a:stretch>
+                    <a:fillRect/>
+                  </a:stretch>
+                </pic:blipFill>
+                <pic:spPr>
+                  <a:xfrm>
+                    <a:off x="0" y="0"/>
+                    <a:ext cx="1342832" cy="360000"/>
+                  </a:xfrm>
+                  <a:prstGeom prst="rect"/>
+                </pic:spPr>
+              </pic:pic>
+            </a:graphicData>
+          </a:graphic>
+        </wp:inline>
+      </w:drawing>
+    </w:r>
   </w:p>
-  <w:tbl>
-    <w:tblPr>
-      <w:tblW w:type="dxa" w:w="9639"/>
-      <w:tblLayout w:type="fixed"/>
-      <w:tblLook w:firstColumn="1" w:firstRow="1" w:lastColumn="0" w:lastRow="0" w:noHBand="0" w:noVBand="1" w:val="04A0"/>
-      <w:tblLayout w:type="fixed"/>
-    </w:tblPr>
-    <w:tblGrid>
-      <w:gridCol w:w="5669"/>
-      <w:gridCol w:w="3969"/>
-    </w:tblGrid>
-    <w:tr>
-      <w:tc>
-        <w:tcPr>
-          <w:tcW w:type="dxa" w:w="5669"/>
-        </w:tcPr>
-        <w:p>
-          <w:r>
-            <w:drawing>
-              <wp:inline xmlns:a="http://schemas.openxmlformats.org/drawingml/2006/main" xmlns:pic="http://schemas.openxmlformats.org/drawingml/2006/picture">
-                <wp:extent cx="1342832" cy="360000"/>
-                <wp:docPr id="1" name="Picture 1"/>
-                <wp:cNvGraphicFramePr>
-                  <a:graphicFrameLocks noChangeAspect="1"/>
-                </wp:cNvGraphicFramePr>
-                <a:graphic>
-                  <a:graphicData uri="http://schemas.openxmlformats.org/drawingml/2006/picture">
-                    <pic:pic>
-                      <pic:nvPicPr>
-                        <pic:cNvPr id="0" name="image.png"/>
-                        <pic:cNvPicPr/>
-                      </pic:nvPicPr>
-                      <pic:blipFill>
-                        <a:blip r:embed="rId1"/>
-                        <a:stretch>
-                          <a:fillRect/>
-                        </a:stretch>
-                      </pic:blipFill>
-                      <pic:spPr>
-                        <a:xfrm>
-                          <a:off x="0" y="0"/>
-                          <a:ext cx="1342832" cy="360000"/>
-                        </a:xfrm>
-                        <a:prstGeom prst="rect"/>
-                      </pic:spPr>
-                    </pic:pic>
-                  </a:graphicData>
-                </a:graphic>
-              </wp:inline>
-            </w:drawing>
-          </w:r>
-        </w:p>
-      </w:tc>
-      <w:tc>
-        <w:tcPr>
-          <w:tcW w:type="dxa" w:w="3969"/>
-          <w:vAlign w:val="center"/>
-        </w:tcPr>
-        <w:p>
-          <w:pPr>
-            <w:jc w:val="right"/>
-          </w:pPr>
-          <w:r>
-            <w:rPr>
-              <w:rFonts w:ascii="Poppins" w:hAnsi="Poppins" w:eastAsia="Poppins"/>
-              <w:b/>
-              <w:i w:val="0"/>
-              <w:color w:val="A87D22"/>
-              <w:sz w:val="15"/>
-            </w:rPr>
-            <w:t>EDIFICIO INOX · REPÚBLICA ARGENTINA</w:t>
-          </w:r>
-        </w:p>
-      </w:tc>
-    </w:tr>
-  </w:tbl>
   <w:p>
     <w:pPr>
       <w:spacing w:after="0"/>
       <w:pBdr>
-        <w:bottom w:val="single" w:sz="4" w:color="DAD2C0"/>
+        <w:bottom w:val="single" w:sz="4" w:color="C9982E"/>
       </w:pBdr>
     </w:pPr>
   </w:p>

</xml_diff>

<commit_message>
REPARG-001: v3.1 con C.I. de firmantes, firma del broker abreviada y pie corregido
- C.I. de Juan José Castillo (9289273) y de Mabel Torrico (2035707).
- Firma del broker en 3 renglones, sin 'MERIDIANO CAPITAL'; rol
  'INMOBILIARIA COLOCADORA' en mayúsculas, igual que los demás firmantes.
- Número de página del pie como campo completo con tipografía Poppins 7 pt
  (antes salía con el tamaño por defecto).

Co-Authored-By: Claude Opus 5.5 <noreply@anthropic.com>
Claude-Session: https://claude.ai/code/session_013JkVV9TZYdzYDskFW6suGV
</commit_message>
<xml_diff>
--- a/contracts/cases/REPARG-001/client-response/Respuesta_Contraoferta_Republica_Argentina_Meridiano.docx
+++ b/contracts/cases/REPARG-001/client-response/Respuesta_Contraoferta_Republica_Argentina_Meridiano.docx
@@ -1459,7 +1459,7 @@
                 <w:color w:val="2A2620"/>
                 <w:sz w:val="16"/>
               </w:rPr>
-              <w:t>C.I. N.º ______________</w:t>
+              <w:t>C.I. N.º 2035707</w:t>
             </w:r>
           </w:p>
           <w:p>
@@ -1579,29 +1579,12 @@
             <w:r>
               <w:rPr>
                 <w:rFonts w:ascii="Poppins" w:hAnsi="Poppins" w:eastAsia="Poppins"/>
-                <w:b/>
+                <w:b w:val="0"/>
                 <w:i w:val="0"/>
                 <w:color w:val="2A2620"/>
                 <w:sz w:val="16"/>
               </w:rPr>
-              <w:t>Broker Inmobiliario</w:t>
-            </w:r>
-          </w:p>
-          <w:p>
-            <w:pPr>
-              <w:keepNext/>
-              <w:spacing w:after="0"/>
-              <w:jc w:val="center"/>
-            </w:pPr>
-            <w:r>
-              <w:rPr>
-                <w:rFonts w:ascii="Poppins" w:hAnsi="Poppins" w:eastAsia="Poppins"/>
-                <w:b/>
-                <w:i w:val="0"/>
-                <w:color w:val="14313A"/>
-                <w:sz w:val="16"/>
-              </w:rPr>
-              <w:t>MERIDIANO CAPITAL</w:t>
+              <w:t>C.I. N.º 9289273 · Broker Inmobiliario</w:t>
             </w:r>
           </w:p>
           <w:p>
@@ -1618,7 +1601,7 @@
                 <w:color w:val="A87D22"/>
                 <w:sz w:val="16"/>
               </w:rPr>
-              <w:t>Inmobiliaria colocadora</w:t>
+              <w:t>INMOBILIARIA COLOCADORA</w:t>
             </w:r>
           </w:p>
         </w:tc>
@@ -2292,8 +2275,6 @@
         <w:sz w:val="14"/>
       </w:rPr>
       <w:fldChar w:fldCharType="begin"/>
-      <w:instrText xml:space="preserve">PAGE</w:instrText>
-      <w:fldChar w:fldCharType="end"/>
     </w:r>
     <w:r>
       <w:rPr>
@@ -2303,7 +2284,7 @@
         <w:color w:val="6B6154"/>
         <w:sz w:val="14"/>
       </w:rPr>
-      <w:t xml:space="preserve"> de </w:t>
+      <w:instrText xml:space="preserve"> PAGE </w:instrText>
     </w:r>
     <w:r>
       <w:rPr>
@@ -2313,8 +2294,86 @@
         <w:color w:val="6B6154"/>
         <w:sz w:val="14"/>
       </w:rPr>
+      <w:fldChar w:fldCharType="separate"/>
+    </w:r>
+    <w:r>
+      <w:rPr>
+        <w:rFonts w:ascii="Poppins" w:hAnsi="Poppins" w:eastAsia="Poppins"/>
+        <w:b w:val="0"/>
+        <w:i w:val="0"/>
+        <w:color w:val="6B6154"/>
+        <w:sz w:val="14"/>
+      </w:rPr>
+      <w:t>1</w:t>
+    </w:r>
+    <w:r>
+      <w:rPr>
+        <w:rFonts w:ascii="Poppins" w:hAnsi="Poppins" w:eastAsia="Poppins"/>
+        <w:b w:val="0"/>
+        <w:i w:val="0"/>
+        <w:color w:val="6B6154"/>
+        <w:sz w:val="14"/>
+      </w:rPr>
+      <w:fldChar w:fldCharType="end"/>
+    </w:r>
+    <w:r>
+      <w:rPr>
+        <w:rFonts w:ascii="Poppins" w:hAnsi="Poppins" w:eastAsia="Poppins"/>
+        <w:b w:val="0"/>
+        <w:i w:val="0"/>
+        <w:color w:val="6B6154"/>
+        <w:sz w:val="14"/>
+      </w:rPr>
+      <w:t xml:space="preserve"> de </w:t>
+    </w:r>
+    <w:r>
+      <w:rPr>
+        <w:rFonts w:ascii="Poppins" w:hAnsi="Poppins" w:eastAsia="Poppins"/>
+        <w:b w:val="0"/>
+        <w:i w:val="0"/>
+        <w:color w:val="6B6154"/>
+        <w:sz w:val="14"/>
+      </w:rPr>
       <w:fldChar w:fldCharType="begin"/>
-      <w:instrText xml:space="preserve">NUMPAGES</w:instrText>
+    </w:r>
+    <w:r>
+      <w:rPr>
+        <w:rFonts w:ascii="Poppins" w:hAnsi="Poppins" w:eastAsia="Poppins"/>
+        <w:b w:val="0"/>
+        <w:i w:val="0"/>
+        <w:color w:val="6B6154"/>
+        <w:sz w:val="14"/>
+      </w:rPr>
+      <w:instrText xml:space="preserve"> NUMPAGES </w:instrText>
+    </w:r>
+    <w:r>
+      <w:rPr>
+        <w:rFonts w:ascii="Poppins" w:hAnsi="Poppins" w:eastAsia="Poppins"/>
+        <w:b w:val="0"/>
+        <w:i w:val="0"/>
+        <w:color w:val="6B6154"/>
+        <w:sz w:val="14"/>
+      </w:rPr>
+      <w:fldChar w:fldCharType="separate"/>
+    </w:r>
+    <w:r>
+      <w:rPr>
+        <w:rFonts w:ascii="Poppins" w:hAnsi="Poppins" w:eastAsia="Poppins"/>
+        <w:b w:val="0"/>
+        <w:i w:val="0"/>
+        <w:color w:val="6B6154"/>
+        <w:sz w:val="14"/>
+      </w:rPr>
+      <w:t>1</w:t>
+    </w:r>
+    <w:r>
+      <w:rPr>
+        <w:rFonts w:ascii="Poppins" w:hAnsi="Poppins" w:eastAsia="Poppins"/>
+        <w:b w:val="0"/>
+        <w:i w:val="0"/>
+        <w:color w:val="6B6154"/>
+        <w:sz w:val="14"/>
+      </w:rPr>
       <w:fldChar w:fldCharType="end"/>
     </w:r>
   </w:p>

</xml_diff>